<commit_message>
[update]: adds backordered list
</commit_message>
<xml_diff>
--- a/templates/proposal-template.docx
+++ b/templates/proposal-template.docx
@@ -1186,7 +1186,7 @@
               <w:spacing w:before="0" w:after="0"/>
               <w:jc w:val="both"/>
               <w:rPr>
-                <w:color w:val="000000"/>
+                <w:color w:themeColor="text1" w:val="000000"/>
                 <w:sz w:val="24"/>
                 <w:szCs w:val="24"/>
               </w:rPr>
@@ -1495,47 +1495,7 @@
                 <w:sz w:val="24"/>
                 <w:szCs w:val="24"/>
               </w:rPr>
-              <w:t>{su</w:t>
-            </w:r>
-            <w:r>
-              <w:rPr>
-                <w:b/>
-                <w:bCs/>
-                <w:color w:themeColor="text1" w:val="000000"/>
-                <w:sz w:val="24"/>
-                <w:szCs w:val="24"/>
-              </w:rPr>
-              <w:t>b</w:t>
-            </w:r>
-            <w:r>
-              <w:rPr>
-                <w:b/>
-                <w:bCs/>
-                <w:color w:themeColor="text1" w:val="000000"/>
-                <w:sz w:val="24"/>
-                <w:szCs w:val="24"/>
-              </w:rPr>
-              <w:t>tota</w:t>
-            </w:r>
-            <w:r>
-              <w:rPr>
-                <w:b/>
-                <w:bCs/>
-                <w:color w:themeColor="text1" w:val="000000"/>
-                <w:sz w:val="24"/>
-                <w:szCs w:val="24"/>
-              </w:rPr>
-              <w:t>l</w:t>
-            </w:r>
-            <w:r>
-              <w:rPr>
-                <w:b/>
-                <w:bCs/>
-                <w:color w:themeColor="text1" w:val="000000"/>
-                <w:sz w:val="24"/>
-                <w:szCs w:val="24"/>
-              </w:rPr>
-              <w:t>Net}€</w:t>
+              <w:t>{subtotalNet}€</w:t>
             </w:r>
           </w:p>
         </w:tc>
@@ -1915,23 +1875,7 @@
                 <w:sz w:val="24"/>
                 <w:szCs w:val="24"/>
               </w:rPr>
-              <w:t>{total</w:t>
-            </w:r>
-            <w:r>
-              <w:rPr>
-                <w:color w:themeColor="text1" w:val="000000"/>
-                <w:sz w:val="24"/>
-                <w:szCs w:val="24"/>
-              </w:rPr>
-              <w:t>G</w:t>
-            </w:r>
-            <w:r>
-              <w:rPr>
-                <w:color w:themeColor="text1" w:val="000000"/>
-                <w:sz w:val="24"/>
-                <w:szCs w:val="24"/>
-              </w:rPr>
-              <w:t>rossPrice}€</w:t>
+              <w:t>{totalGrossPrice}€</w:t>
             </w:r>
           </w:p>
         </w:tc>
@@ -2103,7 +2047,7 @@
         <w:pStyle w:val="Normal"/>
         <w:widowControl/>
         <w:spacing w:lineRule="auto" w:line="240" w:before="0" w:after="160"/>
-        <w:jc w:val="left"/>
+        <w:jc w:val="center"/>
         <w:rPr>
           <w:rFonts w:ascii="Calibri" w:hAnsi="Calibri" w:eastAsia="Calibri" w:cs="Calibri"/>
           <w:b w:val="false"/>
@@ -2141,7 +2085,7 @@
         <w:pStyle w:val="Normal"/>
         <w:widowControl/>
         <w:spacing w:lineRule="auto" w:line="240" w:before="0" w:after="160"/>
-        <w:jc w:val="left"/>
+        <w:jc w:val="center"/>
         <w:rPr>
           <w:rFonts w:ascii="Calibri" w:hAnsi="Calibri" w:eastAsia="Calibri" w:cs="Calibri"/>
           <w:b w:val="false"/>
@@ -2171,7 +2115,7 @@
           <w:szCs w:val="24"/>
           <w:lang w:val="de-DE"/>
         </w:rPr>
-        <w:t>{%src}</w:t>
+        <w:t>{@imageXml}</w:t>
       </w:r>
     </w:p>
     <w:p>
@@ -2179,7 +2123,7 @@
         <w:pStyle w:val="Normal"/>
         <w:widowControl/>
         <w:spacing w:lineRule="auto" w:line="240" w:before="0" w:after="160"/>
-        <w:jc w:val="left"/>
+        <w:jc w:val="center"/>
         <w:rPr>
           <w:rFonts w:ascii="Calibri" w:hAnsi="Calibri" w:eastAsia="Calibri" w:cs="Calibri"/>
           <w:b w:val="false"/>
@@ -2310,7 +2254,7 @@
           <w:sz w:val="24"/>
           <w:szCs w:val="24"/>
         </w:rPr>
-        <w:t xml:space="preserve">{estimatedDeliverDay}Arbeitstage nach Auftragseingang und Erhalt aller    </w:t>
+        <w:t xml:space="preserve">{deliveryTime}Arbeitstage nach Auftragseingang und Erhalt aller    </w:t>
       </w:r>
       <w:r>
         <w:rPr/>
@@ -2344,7 +2288,7 @@
           <w:sz w:val="24"/>
           <w:szCs w:val="24"/>
         </w:rPr>
-        <w:t>{#hasLargeValue}Voraussichtl. Leistungsdatum: {estimatedDeliveryDay}</w:t>
+        <w:t>{#hasLargeValue}Voraussichtl. Leistungsdatum: {deliveryTime}</w:t>
       </w:r>
       <w:r>
         <w:rPr>

</xml_diff>

<commit_message>
[update]: removes blank lines
</commit_message>
<xml_diff>
--- a/templates/proposal-template.docx
+++ b/templates/proposal-template.docx
@@ -1186,7 +1186,7 @@
               <w:spacing w:before="0" w:after="0"/>
               <w:jc w:val="both"/>
               <w:rPr>
-                <w:color w:themeColor="text1" w:val="000000"/>
+                <w:color w:val="000000"/>
                 <w:sz w:val="24"/>
                 <w:szCs w:val="24"/>
               </w:rPr>
@@ -1230,6 +1230,17 @@
                 <w:szCs w:val="24"/>
               </w:rPr>
               <w:t>{/pricing}</w:t>
+            </w:r>
+            <w:r>
+              <w:rPr>
+                <w:rFonts w:cs="Calibri"/>
+                <w:b/>
+                <w:bCs/>
+                <w:color w:themeColor="text1" w:val="000000"/>
+                <w:sz w:val="24"/>
+                <w:szCs w:val="24"/>
+              </w:rPr>
+              <w:t>{/services}</w:t>
             </w:r>
           </w:p>
         </w:tc>
@@ -1250,24 +1261,18 @@
             <w:pPr>
               <w:pStyle w:val="Normal"/>
               <w:spacing w:before="0" w:after="0"/>
-              <w:jc w:val="center"/>
-              <w:rPr>
-                <w:b/>
-                <w:bCs/>
-                <w:color w:themeColor="text1" w:val="000000"/>
+              <w:rPr>
+                <w:color w:val="000000"/>
                 <w:sz w:val="24"/>
                 <w:szCs w:val="24"/>
               </w:rPr>
             </w:pPr>
             <w:r>
               <w:rPr>
-                <w:b/>
-                <w:bCs/>
-                <w:color w:themeColor="text1" w:val="000000"/>
-                <w:sz w:val="24"/>
-                <w:szCs w:val="24"/>
-              </w:rPr>
-              <w:t>{/services}</w:t>
+                <w:color w:val="000000"/>
+                <w:sz w:val="24"/>
+                <w:szCs w:val="24"/>
+              </w:rPr>
             </w:r>
           </w:p>
         </w:tc>
@@ -1286,18 +1291,14 @@
               <w:pStyle w:val="Normal"/>
               <w:spacing w:before="0" w:after="0"/>
               <w:rPr>
-                <w:b/>
-                <w:bCs/>
-                <w:color w:themeColor="text1" w:val="000000"/>
+                <w:color w:val="000000"/>
                 <w:sz w:val="24"/>
                 <w:szCs w:val="24"/>
               </w:rPr>
             </w:pPr>
             <w:r>
               <w:rPr>
-                <w:b/>
-                <w:bCs/>
-                <w:color w:themeColor="text1" w:val="000000"/>
+                <w:color w:val="000000"/>
                 <w:sz w:val="24"/>
                 <w:szCs w:val="24"/>
               </w:rPr>
@@ -1319,7 +1320,8 @@
               <w:pStyle w:val="Normal"/>
               <w:spacing w:before="0" w:after="0"/>
               <w:rPr>
-                <w:rFonts w:ascii="Calibri" w:hAnsi="Calibri" w:cs="Calibri" w:asciiTheme="minorHAnsi" w:cstheme="minorHAnsi" w:hAnsiTheme="minorHAnsi"/>
+                <w:b/>
+                <w:bCs/>
                 <w:color w:val="000000"/>
                 <w:sz w:val="24"/>
                 <w:szCs w:val="24"/>
@@ -1327,7 +1329,8 @@
             </w:pPr>
             <w:r>
               <w:rPr>
-                <w:rFonts w:cs="Calibri" w:cstheme="minorHAnsi"/>
+                <w:b/>
+                <w:bCs/>
                 <w:color w:val="000000"/>
                 <w:sz w:val="24"/>
                 <w:szCs w:val="24"/>
@@ -1353,7 +1356,7 @@
               <w:rPr>
                 <w:b/>
                 <w:bCs/>
-                <w:color w:themeColor="text1" w:val="000000"/>
+                <w:color w:val="000000"/>
                 <w:sz w:val="24"/>
                 <w:szCs w:val="24"/>
               </w:rPr>
@@ -1362,7 +1365,7 @@
               <w:rPr>
                 <w:b/>
                 <w:bCs/>
-                <w:color w:themeColor="text1" w:val="000000"/>
+                <w:color w:val="000000"/>
                 <w:sz w:val="24"/>
                 <w:szCs w:val="24"/>
               </w:rPr>
@@ -1376,7 +1379,6 @@
           <w:tcPr>
             <w:tcW w:w="993" w:type="dxa"/>
             <w:tcBorders>
-              <w:top w:val="single" w:sz="4" w:space="0" w:color="000000"/>
               <w:left w:val="single" w:sz="4" w:space="0" w:color="000000"/>
               <w:bottom w:val="single" w:sz="4" w:space="0" w:color="000000"/>
               <w:right w:val="single" w:sz="4" w:space="0" w:color="000000"/>
@@ -1405,7 +1407,6 @@
           <w:tcPr>
             <w:tcW w:w="1842" w:type="dxa"/>
             <w:tcBorders>
-              <w:top w:val="single" w:sz="4" w:space="0" w:color="000000"/>
               <w:left w:val="single" w:sz="4" w:space="0" w:color="000000"/>
               <w:bottom w:val="single" w:sz="4" w:space="0" w:color="000000"/>
               <w:right w:val="single" w:sz="4" w:space="0" w:color="000000"/>
@@ -1434,7 +1435,6 @@
           <w:tcPr>
             <w:tcW w:w="4966" w:type="dxa"/>
             <w:tcBorders>
-              <w:top w:val="single" w:sz="4" w:space="0" w:color="000000"/>
               <w:left w:val="single" w:sz="4" w:space="0" w:color="000000"/>
               <w:bottom w:val="single" w:sz="4" w:space="0" w:color="000000"/>
               <w:right w:val="single" w:sz="4" w:space="0" w:color="000000"/>
@@ -1468,7 +1468,6 @@
           <w:tcPr>
             <w:tcW w:w="1270" w:type="dxa"/>
             <w:tcBorders>
-              <w:top w:val="single" w:sz="4" w:space="0" w:color="000000"/>
               <w:left w:val="single" w:sz="4" w:space="0" w:color="000000"/>
               <w:bottom w:val="single" w:sz="4" w:space="0" w:color="000000"/>
               <w:right w:val="single" w:sz="4" w:space="0" w:color="000000"/>

</xml_diff>

<commit_message>
[update]: corrects priicing bugs
</commit_message>
<xml_diff>
--- a/templates/proposal-template.docx
+++ b/templates/proposal-template.docx
@@ -961,144 +961,6 @@
                 <w:szCs w:val="24"/>
               </w:rPr>
               <w:t>{unitPrice}</w:t>
-            </w:r>
-          </w:p>
-        </w:tc>
-      </w:tr>
-      <w:tr>
-        <w:trPr/>
-        <w:tc>
-          <w:tcPr>
-            <w:tcW w:w="993" w:type="dxa"/>
-            <w:tcBorders>
-              <w:top w:val="single" w:sz="4" w:space="0" w:color="000000"/>
-              <w:left w:val="single" w:sz="4" w:space="0" w:color="000000"/>
-              <w:bottom w:val="single" w:sz="4" w:space="0" w:color="000000"/>
-              <w:right w:val="single" w:sz="4" w:space="0" w:color="000000"/>
-            </w:tcBorders>
-          </w:tcPr>
-          <w:p>
-            <w:pPr>
-              <w:pStyle w:val="Normal"/>
-              <w:spacing w:before="0" w:after="0"/>
-              <w:jc w:val="center"/>
-              <w:rPr>
-                <w:b/>
-                <w:bCs/>
-                <w:color w:themeColor="text1" w:val="000000"/>
-                <w:sz w:val="24"/>
-                <w:szCs w:val="24"/>
-              </w:rPr>
-            </w:pPr>
-            <w:r>
-              <w:rPr>
-                <w:b/>
-                <w:bCs/>
-                <w:color w:themeColor="text1" w:val="000000"/>
-                <w:sz w:val="24"/>
-                <w:szCs w:val="24"/>
-              </w:rPr>
-              <w:t>{#hasPricingTiers}</w:t>
-            </w:r>
-          </w:p>
-        </w:tc>
-        <w:tc>
-          <w:tcPr>
-            <w:tcW w:w="1842" w:type="dxa"/>
-            <w:tcBorders>
-              <w:top w:val="single" w:sz="4" w:space="0" w:color="000000"/>
-              <w:left w:val="single" w:sz="4" w:space="0" w:color="000000"/>
-              <w:bottom w:val="single" w:sz="4" w:space="0" w:color="000000"/>
-              <w:right w:val="single" w:sz="4" w:space="0" w:color="000000"/>
-            </w:tcBorders>
-          </w:tcPr>
-          <w:p>
-            <w:pPr>
-              <w:pStyle w:val="Normal"/>
-              <w:spacing w:before="0" w:after="0"/>
-              <w:rPr>
-                <w:b/>
-                <w:bCs/>
-                <w:color w:themeColor="text1" w:val="000000"/>
-                <w:sz w:val="24"/>
-                <w:szCs w:val="24"/>
-              </w:rPr>
-            </w:pPr>
-            <w:r>
-              <w:rPr>
-                <w:b/>
-                <w:bCs/>
-                <w:color w:themeColor="text1" w:val="000000"/>
-                <w:sz w:val="24"/>
-                <w:szCs w:val="24"/>
-              </w:rPr>
-            </w:r>
-          </w:p>
-        </w:tc>
-        <w:tc>
-          <w:tcPr>
-            <w:tcW w:w="4966" w:type="dxa"/>
-            <w:tcBorders>
-              <w:top w:val="single" w:sz="4" w:space="0" w:color="000000"/>
-              <w:left w:val="single" w:sz="4" w:space="0" w:color="000000"/>
-              <w:bottom w:val="single" w:sz="4" w:space="0" w:color="000000"/>
-              <w:right w:val="single" w:sz="4" w:space="0" w:color="000000"/>
-            </w:tcBorders>
-          </w:tcPr>
-          <w:p>
-            <w:pPr>
-              <w:pStyle w:val="Normal"/>
-              <w:spacing w:before="0" w:after="0"/>
-              <w:rPr>
-                <w:rFonts w:ascii="Calibri" w:hAnsi="Calibri" w:cs="Calibri" w:asciiTheme="minorHAnsi" w:cstheme="minorHAnsi" w:hAnsiTheme="minorHAnsi"/>
-                <w:color w:val="000000"/>
-                <w:sz w:val="24"/>
-                <w:szCs w:val="24"/>
-              </w:rPr>
-            </w:pPr>
-            <w:r>
-              <w:rPr>
-                <w:rFonts w:cs="Calibri" w:cstheme="minorHAnsi"/>
-                <w:color w:val="000000"/>
-                <w:sz w:val="24"/>
-                <w:szCs w:val="24"/>
-              </w:rPr>
-              <w:t>Preisstaffelung:</w:t>
-            </w:r>
-          </w:p>
-        </w:tc>
-        <w:tc>
-          <w:tcPr>
-            <w:tcW w:w="1270" w:type="dxa"/>
-            <w:tcBorders>
-              <w:top w:val="single" w:sz="4" w:space="0" w:color="000000"/>
-              <w:left w:val="single" w:sz="4" w:space="0" w:color="000000"/>
-              <w:bottom w:val="single" w:sz="4" w:space="0" w:color="000000"/>
-              <w:right w:val="single" w:sz="4" w:space="0" w:color="000000"/>
-            </w:tcBorders>
-          </w:tcPr>
-          <w:p>
-            <w:pPr>
-              <w:pStyle w:val="Normal"/>
-              <w:spacing w:before="0" w:after="0"/>
-              <w:jc w:val="center"/>
-              <w:rPr>
-                <w:b/>
-                <w:bCs/>
-                <w:color w:themeColor="text1" w:val="000000"/>
-                <w:sz w:val="24"/>
-                <w:szCs w:val="24"/>
-              </w:rPr>
-            </w:pPr>
-            <w:r>
-              <w:rPr>
-                <w:b/>
-                <w:bCs/>
-                <w:color w:themeColor="text1" w:val="000000"/>
-                <w:sz w:val="24"/>
-                <w:szCs w:val="24"/>
-              </w:rPr>
-              <w:t>{/hasPricingTiers}</w:t>
             </w:r>
           </w:p>
         </w:tc>

</xml_diff>

<commit_message>
[updat]: makes italicised paragraphs editable
</commit_message>
<xml_diff>
--- a/templates/proposal-template.docx
+++ b/templates/proposal-template.docx
@@ -1048,7 +1048,7 @@
               <w:spacing w:before="0" w:after="0"/>
               <w:jc w:val="both"/>
               <w:rPr>
-                <w:color w:val="000000"/>
+                <w:color w:themeColor="text1" w:val="000000"/>
                 <w:sz w:val="24"/>
                 <w:szCs w:val="24"/>
               </w:rPr>
@@ -1077,9 +1077,10 @@
             <w:pPr>
               <w:pStyle w:val="Normal"/>
               <w:spacing w:before="0" w:after="0"/>
-              <w:jc w:val="both"/>
-              <w:rPr>
-                <w:rFonts w:ascii="Calibri" w:hAnsi="Calibri" w:cs="Calibri" w:asciiTheme="minorAscii" w:cstheme="minorAscii" w:hAnsiTheme="minorAscii"/>
+              <w:jc w:val="center"/>
+              <w:rPr>
+                <w:b/>
+                <w:bCs/>
                 <w:color w:themeColor="text1" w:val="000000"/>
                 <w:sz w:val="24"/>
                 <w:szCs w:val="24"/>
@@ -1095,14 +1096,141 @@
             </w:r>
             <w:r>
               <w:rPr>
-                <w:rFonts w:cs="Calibri"/>
                 <w:b/>
                 <w:bCs/>
                 <w:color w:themeColor="text1" w:val="000000"/>
                 <w:sz w:val="24"/>
                 <w:szCs w:val="24"/>
               </w:rPr>
-              <w:t>{/services}</w:t>
+              <w:t xml:space="preserve"> {/services}</w:t>
+            </w:r>
+          </w:p>
+        </w:tc>
+      </w:tr>
+      <w:tr>
+        <w:trPr>
+          <w:trHeight w:val="300" w:hRule="atLeast"/>
+        </w:trPr>
+        <w:tc>
+          <w:tcPr>
+            <w:tcW w:w="993" w:type="dxa"/>
+            <w:tcBorders>
+              <w:top w:val="single" w:sz="4" w:space="0" w:color="000000"/>
+              <w:left w:val="single" w:sz="4" w:space="0" w:color="000000"/>
+              <w:bottom w:val="single" w:sz="4" w:space="0" w:color="000000"/>
+              <w:right w:val="single" w:sz="4" w:space="0" w:color="000000"/>
+            </w:tcBorders>
+          </w:tcPr>
+          <w:p>
+            <w:pPr>
+              <w:pStyle w:val="Normal"/>
+              <w:spacing w:before="0" w:after="160"/>
+              <w:jc w:val="both"/>
+              <w:rPr>
+                <w:color w:themeColor="text1" w:val="000000"/>
+                <w:sz w:val="24"/>
+                <w:szCs w:val="24"/>
+              </w:rPr>
+            </w:pPr>
+            <w:r>
+              <w:rPr>
+                <w:color w:themeColor="text1" w:val="000000"/>
+                <w:sz w:val="24"/>
+                <w:szCs w:val="24"/>
+              </w:rPr>
+            </w:r>
+          </w:p>
+        </w:tc>
+        <w:tc>
+          <w:tcPr>
+            <w:tcW w:w="1842" w:type="dxa"/>
+            <w:tcBorders>
+              <w:top w:val="single" w:sz="4" w:space="0" w:color="000000"/>
+              <w:left w:val="single" w:sz="4" w:space="0" w:color="000000"/>
+              <w:bottom w:val="single" w:sz="4" w:space="0" w:color="000000"/>
+              <w:right w:val="single" w:sz="4" w:space="0" w:color="000000"/>
+            </w:tcBorders>
+          </w:tcPr>
+          <w:p>
+            <w:pPr>
+              <w:pStyle w:val="Normal"/>
+              <w:spacing w:before="0" w:after="160"/>
+              <w:rPr>
+                <w:b/>
+                <w:bCs/>
+                <w:color w:themeColor="text1" w:val="000000"/>
+                <w:sz w:val="24"/>
+                <w:szCs w:val="24"/>
+              </w:rPr>
+            </w:pPr>
+            <w:r>
+              <w:rPr>
+                <w:b/>
+                <w:bCs/>
+                <w:color w:themeColor="text1" w:val="000000"/>
+                <w:sz w:val="24"/>
+                <w:szCs w:val="24"/>
+              </w:rPr>
+            </w:r>
+          </w:p>
+        </w:tc>
+        <w:tc>
+          <w:tcPr>
+            <w:tcW w:w="4966" w:type="dxa"/>
+            <w:tcBorders>
+              <w:top w:val="single" w:sz="4" w:space="0" w:color="000000"/>
+              <w:left w:val="single" w:sz="4" w:space="0" w:color="000000"/>
+              <w:bottom w:val="single" w:sz="4" w:space="0" w:color="000000"/>
+              <w:right w:val="single" w:sz="4" w:space="0" w:color="000000"/>
+            </w:tcBorders>
+          </w:tcPr>
+          <w:p>
+            <w:pPr>
+              <w:pStyle w:val="Normal"/>
+              <w:spacing w:before="0" w:after="160"/>
+              <w:jc w:val="both"/>
+              <w:rPr>
+                <w:color w:themeColor="text1" w:val="000000"/>
+                <w:sz w:val="24"/>
+                <w:szCs w:val="24"/>
+              </w:rPr>
+            </w:pPr>
+            <w:r>
+              <w:rPr>
+                <w:color w:themeColor="text1" w:val="000000"/>
+                <w:sz w:val="24"/>
+                <w:szCs w:val="24"/>
+              </w:rPr>
+            </w:r>
+          </w:p>
+        </w:tc>
+        <w:tc>
+          <w:tcPr>
+            <w:tcW w:w="1270" w:type="dxa"/>
+            <w:tcBorders>
+              <w:top w:val="single" w:sz="4" w:space="0" w:color="000000"/>
+              <w:left w:val="single" w:sz="4" w:space="0" w:color="000000"/>
+              <w:bottom w:val="single" w:sz="4" w:space="0" w:color="000000"/>
+              <w:right w:val="single" w:sz="4" w:space="0" w:color="000000"/>
+            </w:tcBorders>
+          </w:tcPr>
+          <w:p>
+            <w:pPr>
+              <w:pStyle w:val="Normal"/>
+              <w:spacing w:before="0" w:after="160"/>
+              <w:jc w:val="center"/>
+              <w:rPr>
+                <w:color w:themeColor="text1" w:val="000000"/>
+                <w:sz w:val="24"/>
+                <w:szCs w:val="24"/>
+              </w:rPr>
+            </w:pPr>
+            <w:r>
+              <w:rPr>
+                <w:color w:themeColor="text1" w:val="000000"/>
+                <w:sz w:val="24"/>
+                <w:szCs w:val="24"/>
+              </w:rPr>
             </w:r>
           </w:p>
         </w:tc>
@@ -1197,6 +1325,7 @@
                 <w:sz w:val="24"/>
                 <w:szCs w:val="24"/>
               </w:rPr>
+              <w:t>Gesamtpreis Netto</w:t>
             </w:r>
           </w:p>
         </w:tc>
@@ -1205,131 +1334,6 @@
             <w:tcW w:w="1270" w:type="dxa"/>
             <w:tcBorders>
               <w:top w:val="single" w:sz="4" w:space="0" w:color="000000"/>
-              <w:left w:val="single" w:sz="4" w:space="0" w:color="000000"/>
-              <w:bottom w:val="single" w:sz="4" w:space="0" w:color="000000"/>
-              <w:right w:val="single" w:sz="4" w:space="0" w:color="000000"/>
-            </w:tcBorders>
-          </w:tcPr>
-          <w:p>
-            <w:pPr>
-              <w:pStyle w:val="Normal"/>
-              <w:spacing w:before="0" w:after="0"/>
-              <w:jc w:val="right"/>
-              <w:rPr>
-                <w:b/>
-                <w:bCs/>
-                <w:color w:val="000000"/>
-                <w:sz w:val="24"/>
-                <w:szCs w:val="24"/>
-              </w:rPr>
-            </w:pPr>
-            <w:r>
-              <w:rPr>
-                <w:b/>
-                <w:bCs/>
-                <w:color w:val="000000"/>
-                <w:sz w:val="24"/>
-                <w:szCs w:val="24"/>
-              </w:rPr>
-            </w:r>
-          </w:p>
-        </w:tc>
-      </w:tr>
-      <w:tr>
-        <w:trPr/>
-        <w:tc>
-          <w:tcPr>
-            <w:tcW w:w="993" w:type="dxa"/>
-            <w:tcBorders>
-              <w:left w:val="single" w:sz="4" w:space="0" w:color="000000"/>
-              <w:bottom w:val="single" w:sz="4" w:space="0" w:color="000000"/>
-              <w:right w:val="single" w:sz="4" w:space="0" w:color="000000"/>
-            </w:tcBorders>
-          </w:tcPr>
-          <w:p>
-            <w:pPr>
-              <w:pStyle w:val="Normal"/>
-              <w:spacing w:before="0" w:after="0"/>
-              <w:rPr>
-                <w:color w:val="000000"/>
-                <w:sz w:val="24"/>
-                <w:szCs w:val="24"/>
-              </w:rPr>
-            </w:pPr>
-            <w:r>
-              <w:rPr>
-                <w:color w:val="000000"/>
-                <w:sz w:val="24"/>
-                <w:szCs w:val="24"/>
-              </w:rPr>
-            </w:r>
-          </w:p>
-        </w:tc>
-        <w:tc>
-          <w:tcPr>
-            <w:tcW w:w="1842" w:type="dxa"/>
-            <w:tcBorders>
-              <w:left w:val="single" w:sz="4" w:space="0" w:color="000000"/>
-              <w:bottom w:val="single" w:sz="4" w:space="0" w:color="000000"/>
-              <w:right w:val="single" w:sz="4" w:space="0" w:color="000000"/>
-            </w:tcBorders>
-          </w:tcPr>
-          <w:p>
-            <w:pPr>
-              <w:pStyle w:val="Normal"/>
-              <w:spacing w:before="0" w:after="0"/>
-              <w:rPr>
-                <w:color w:val="000000"/>
-                <w:sz w:val="24"/>
-                <w:szCs w:val="24"/>
-              </w:rPr>
-            </w:pPr>
-            <w:r>
-              <w:rPr>
-                <w:color w:val="000000"/>
-                <w:sz w:val="24"/>
-                <w:szCs w:val="24"/>
-              </w:rPr>
-            </w:r>
-          </w:p>
-        </w:tc>
-        <w:tc>
-          <w:tcPr>
-            <w:tcW w:w="4966" w:type="dxa"/>
-            <w:tcBorders>
-              <w:left w:val="single" w:sz="4" w:space="0" w:color="000000"/>
-              <w:bottom w:val="single" w:sz="4" w:space="0" w:color="000000"/>
-              <w:right w:val="single" w:sz="4" w:space="0" w:color="000000"/>
-            </w:tcBorders>
-          </w:tcPr>
-          <w:p>
-            <w:pPr>
-              <w:pStyle w:val="Normal"/>
-              <w:spacing w:before="0" w:after="0"/>
-              <w:rPr>
-                <w:b/>
-                <w:bCs/>
-                <w:color w:val="000000"/>
-                <w:sz w:val="24"/>
-                <w:szCs w:val="24"/>
-              </w:rPr>
-            </w:pPr>
-            <w:r>
-              <w:rPr>
-                <w:b/>
-                <w:bCs/>
-                <w:color w:val="000000"/>
-                <w:sz w:val="24"/>
-                <w:szCs w:val="24"/>
-              </w:rPr>
-              <w:t>Gesamtpreis Netto</w:t>
-            </w:r>
-          </w:p>
-        </w:tc>
-        <w:tc>
-          <w:tcPr>
-            <w:tcW w:w="1270" w:type="dxa"/>
-            <w:tcBorders>
               <w:left w:val="single" w:sz="4" w:space="0" w:color="000000"/>
               <w:bottom w:val="single" w:sz="4" w:space="0" w:color="000000"/>
               <w:right w:val="single" w:sz="4" w:space="0" w:color="000000"/>
@@ -2256,54 +2260,12 @@
         <w:rPr>
           <w:i/>
           <w:iCs/>
-          <w:color w:val="000000"/>
+          <w:color w:themeColor="text1" w:val="000000"/>
           <w:sz w:val="20"/>
           <w:szCs w:val="20"/>
           <w:lang w:val="bg-BG"/>
         </w:rPr>
-        <w:t xml:space="preserve">(1): Sollten Sie nach der </w:t>
-      </w:r>
-      <w:r>
-        <w:rPr>
-          <w:i/>
-          <w:iCs/>
-          <w:color w:val="000000"/>
-          <w:sz w:val="20"/>
-          <w:szCs w:val="20"/>
-        </w:rPr>
-        <w:t>gratis</w:t>
-      </w:r>
-      <w:r>
-        <w:rPr>
-          <w:i/>
-          <w:iCs/>
-          <w:color w:val="000000"/>
-          <w:sz w:val="20"/>
-          <w:szCs w:val="20"/>
-          <w:lang w:val="bg-BG"/>
-        </w:rPr>
-        <w:t xml:space="preserve"> Revision eine weitere Revision benötigen, die nicht durch uns verschuldet wurde, führen wir diese standardmässig für 50 % des Nettopreises pro Visualisierung durch. Unsere effizienten Prozesse und die sehr hohe Qualität führen jedoch dazu, dass in der Regel eine einzige Revision ausreicht: In hunderten von Projekten benötigen unsere Kunden nur in 6 % aller Fälle eine zusätzliche Revision</w:t>
-      </w:r>
-      <w:r>
-        <w:rPr>
-          <w:i/>
-          <w:iCs/>
-          <w:color w:val="000000"/>
-          <w:sz w:val="20"/>
-          <w:szCs w:val="20"/>
-        </w:rPr>
-        <w:t xml:space="preserve">, </w:t>
-      </w:r>
-      <w:r>
-        <w:rPr>
-          <w:i/>
-          <w:iCs/>
-          <w:color w:val="000000"/>
-          <w:sz w:val="20"/>
-          <w:szCs w:val="20"/>
-          <w:lang w:val="bg-BG"/>
-        </w:rPr>
-        <w:t>und auch dann meist nur, wenn sich die Pläne nachträglich deutlich geändert haben.</w:t>
+        <w:t>{p_one}</w:t>
       </w:r>
     </w:p>
     <w:p>
@@ -2324,33 +2286,12 @@
         <w:rPr>
           <w:i/>
           <w:iCs/>
-          <w:color w:val="000000"/>
+          <w:color w:themeColor="text1" w:val="000000"/>
           <w:sz w:val="20"/>
           <w:szCs w:val="20"/>
           <w:lang w:val="bg-BG"/>
         </w:rPr>
-        <w:t xml:space="preserve">Bitte beachten Sie: Bei Änderungen der Pläne (unabhängig davon, ob diese im Rahmen der </w:t>
-      </w:r>
-      <w:r>
-        <w:rPr>
-          <w:i/>
-          <w:iCs/>
-          <w:color w:val="000000"/>
-          <w:sz w:val="20"/>
-          <w:szCs w:val="20"/>
-        </w:rPr>
-        <w:t>gratis</w:t>
-      </w:r>
-      <w:r>
-        <w:rPr>
-          <w:i/>
-          <w:iCs/>
-          <w:color w:val="000000"/>
-          <w:sz w:val="20"/>
-          <w:szCs w:val="20"/>
-          <w:lang w:val="bg-BG"/>
-        </w:rPr>
-        <w:t xml:space="preserve"> oder einer zusätzlichen Revision erfolgen) wird der Preis je nach Umfang der Veränderungen individuell festgelegt. Je nach Umfang dauert eine Revision mindestens 50 % der ursprünglichen Lieferzeit.</w:t>
+        <w:t>{p_two}</w:t>
       </w:r>
     </w:p>
     <w:p>
@@ -2370,11 +2311,11 @@
         <w:rPr>
           <w:i/>
           <w:iCs/>
-          <w:color w:val="000000"/>
+          <w:color w:themeColor="text1" w:val="000000"/>
           <w:sz w:val="20"/>
           <w:szCs w:val="20"/>
         </w:rPr>
-        <w:t>(2): Sollten Sie nach 12 Monaten die Tour immer noch benutzen möchten, können Sie gerne eine Verlängerung des Hostings um weitere 12 Monate optional für 50,00 € beauftragen.</w:t>
+        <w:t>{p_three}</w:t>
       </w:r>
     </w:p>
     <w:p>
@@ -2394,11 +2335,11 @@
         <w:rPr>
           <w:i/>
           <w:iCs/>
-          <w:color w:val="000000"/>
+          <w:color w:themeColor="text1" w:val="000000"/>
           <w:sz w:val="20"/>
           <w:szCs w:val="20"/>
         </w:rPr>
-        <w:t>Haftungsausschluss: Wir sind stets bestrebt, Ihre Visualisierungen so detailgetreu wie möglich zu erstellen. Jedoch dienen die Visualisierungen nur der Veranschaulichung. Folglich wird keine Haftung für eventuelle Schäden auf Grund von Abweichungen übernommen.</w:t>
+        <w:t>{p_four}</w:t>
       </w:r>
     </w:p>
     <w:p>
@@ -2418,11 +2359,11 @@
         <w:rPr>
           <w:i/>
           <w:iCs/>
-          <w:color w:val="000000"/>
+          <w:color w:themeColor="text1" w:val="000000"/>
           <w:sz w:val="20"/>
           <w:szCs w:val="20"/>
         </w:rPr>
-        <w:t>Nutzungsrecht: Die Nutzung der durch uns erstellten Visualisierungen ist erst nach Zahlung gestattet.</w:t>
+        <w:t>{p_five}</w:t>
       </w:r>
     </w:p>
     <w:p>
@@ -2442,38 +2383,11 @@
         <w:rPr>
           <w:i/>
           <w:iCs/>
-          <w:color w:val="000000"/>
+          <w:color w:themeColor="text1" w:val="000000"/>
           <w:sz w:val="20"/>
           <w:szCs w:val="20"/>
         </w:rPr>
-        <w:t>Es gelten unsere allgemeinen Verkaufs- und Lieferbedingungen. Die gültige Version der allgemeinen Verkaufs- und Lieferbedingungen Stand 03/2023 finden Sie auf der Website: https://www.exposeprofi.de/agb. Außerdem auf Anforderung erhältlich.</w:t>
-      </w:r>
-    </w:p>
-    <w:p>
-      <w:pPr>
-        <w:pStyle w:val="Normal"/>
-        <w:spacing w:lineRule="auto" w:line="240"/>
-        <w:rPr>
-          <w:i/>
-          <w:i/>
-          <w:iCs/>
-          <w:color w:val="000000"/>
-          <w:sz w:val="20"/>
-          <w:szCs w:val="20"/>
-        </w:rPr>
-      </w:pPr>
-      <w:bookmarkStart w:id="1" w:name="_Hlk174617329"/>
-      <w:bookmarkEnd w:id="1"/>
-      <w:r>
-        <w:rPr>
-          <w:i/>
-          <w:iCs/>
-          <w:color w:val="000000"/>
-          <w:sz w:val="20"/>
-          <w:szCs w:val="20"/>
-          <w:lang w:val="bg-BG"/>
-        </w:rPr>
-        <w:t>Nach der ersten vollständigen Lieferung aller bestellten Produkte wird das Projekt in Rechnung gestellt. Die im Angebot inbegriffene kostenlose Revision können Sie jederzeit in Anspruch nehmen.</w:t>
+        <w:t>{p_six}</w:t>
       </w:r>
     </w:p>
     <w:p>
@@ -2494,12 +2408,38 @@
         <w:rPr>
           <w:i/>
           <w:iCs/>
+          <w:color w:themeColor="text1" w:val="000000"/>
+          <w:sz w:val="20"/>
+          <w:szCs w:val="20"/>
+          <w:lang w:val="bg-BG"/>
+        </w:rPr>
+        <w:t>{p_seven}</w:t>
+      </w:r>
+    </w:p>
+    <w:p>
+      <w:pPr>
+        <w:pStyle w:val="Normal"/>
+        <w:spacing w:lineRule="auto" w:line="240"/>
+        <w:rPr>
+          <w:i/>
+          <w:i/>
+          <w:iCs/>
           <w:color w:val="000000"/>
           <w:sz w:val="20"/>
           <w:szCs w:val="20"/>
           <w:lang w:val="bg-BG"/>
         </w:rPr>
-        <w:t>Damit wir Ihr Projekt zügig und planbar umsetzen können, reservieren wir feste Kapazitäten. Wenn Sie die vollständigen Unterlagen entgegen Ihrer ursprünglichen Planung nicht innerhalb von 30 Tagen nach Angebotsannahme einreichen können, bleibt Ihr Auftrag selbstverständlich erhalten. Wir wandeln ihn dann einfach in eine Gutscheinrechnung um. Der Gutschein ist 12 Monate gültig und kann flexibel für Visualisierungen des Objektes eingesetzt werden.</w:t>
+      </w:pPr>
+      <w:r>
+        <w:rPr>
+          <w:i/>
+          <w:iCs/>
+          <w:color w:themeColor="text1" w:val="000000"/>
+          <w:sz w:val="20"/>
+          <w:szCs w:val="20"/>
+          <w:lang w:val="bg-BG"/>
+        </w:rPr>
+        <w:t>{p_eight}</w:t>
       </w:r>
     </w:p>
     <w:p>

</xml_diff>

<commit_message>
[update]: removes offer valid untill date error
</commit_message>
<xml_diff>
--- a/templates/proposal-template.docx
+++ b/templates/proposal-template.docx
@@ -2054,14 +2054,6 @@
           <w:lang w:val="de-DE"/>
         </w:rPr>
         <w:t>{offerValidUntil}</w:t>
-      </w:r>
-      <w:r>
-        <w:rPr>
-          <w:color w:themeColor="text1" w:val="000000"/>
-          <w:sz w:val="24"/>
-          <w:szCs w:val="24"/>
-        </w:rPr>
-        <w:t xml:space="preserve">. </w:t>
       </w:r>
     </w:p>
     <w:p>

</xml_diff>

<commit_message>
[update]: cleans the interface
</commit_message>
<xml_diff>
--- a/templates/proposal-template.docx
+++ b/templates/proposal-template.docx
@@ -1898,13 +1898,18 @@
       </w:pPr>
       <w:r>
         <w:rPr>
+          <w:rFonts w:ascii="Ubuntu Mono;Liberation Mono;DejaVu Sans Mono;Courier New;monospace" w:hAnsi="Ubuntu Mono;Liberation Mono;DejaVu Sans Mono;Courier New;monospace"/>
           <w:b/>
           <w:bCs/>
+          <w:i w:val="false"/>
+          <w:caps w:val="false"/>
+          <w:smallCaps w:val="false"/>
           <w:color w:themeColor="text1" w:val="000000"/>
+          <w:spacing w:val="0"/>
           <w:sz w:val="24"/>
           <w:szCs w:val="24"/>
         </w:rPr>
-        <w:t>Empfohlene Perspektiven Außen:</w:t>
+        <w:t>{images_section_title}</w:t>
       </w:r>
     </w:p>
     <w:p>
@@ -2111,7 +2116,7 @@
           <w:sz w:val="24"/>
           <w:szCs w:val="24"/>
         </w:rPr>
-        <w:t xml:space="preserve">{deliveryTime}Arbeitstage nach Auftragseingang und Erhalt aller    </w:t>
+        <w:t xml:space="preserve">{deliveryTime} Arbeitstage nach Auftragseingang und Erhalt aller    </w:t>
       </w:r>
       <w:r>
         <w:rPr/>
@@ -2145,7 +2150,7 @@
           <w:sz w:val="24"/>
           <w:szCs w:val="24"/>
         </w:rPr>
-        <w:t>{#hasLargeValue}Voraussichtl. Leistungsdatum: {deliveryTime}</w:t>
+        <w:t xml:space="preserve">{#hasLargeValue}Voraussichtl. Leistungsdatum: {deliveryTime} </w:t>
       </w:r>
       <w:r>
         <w:rPr>
@@ -2162,7 +2167,7 @@
           <w:sz w:val="24"/>
           <w:szCs w:val="24"/>
         </w:rPr>
-        <w:t xml:space="preserve">nach Eingang der Anzahlung i.H.v. 50% des Bruttopreises ({halfAmount}EUR) </w:t>
+        <w:t xml:space="preserve">nach Eingang der Anzahlung i.H.v. 50% des Bruttopreises ({halfAmount} EUR) </w:t>
       </w:r>
       <w:r>
         <w:rPr>

</xml_diff>

<commit_message>
[update]: adds removes redundant paragraph in the page
</commit_message>
<xml_diff>
--- a/templates/proposal-template.docx
+++ b/templates/proposal-template.docx
@@ -2304,30 +2304,24 @@
           <w:szCs w:val="20"/>
         </w:rPr>
       </w:pPr>
-      <w:r>
-        <w:rPr>
-          <w:i/>
-          <w:iCs/>
-          <w:color w:themeColor="text1" w:val="000000"/>
-          <w:sz w:val="20"/>
-          <w:szCs w:val="20"/>
-        </w:rPr>
-        <w:t>{p_three}</w:t>
-      </w:r>
-    </w:p>
-    <w:p>
-      <w:pPr>
-        <w:pStyle w:val="Normal"/>
-        <w:spacing w:lineRule="auto" w:line="240"/>
-        <w:rPr>
-          <w:i/>
-          <w:i/>
-          <w:iCs/>
-          <w:color w:val="000000"/>
-          <w:sz w:val="20"/>
-          <w:szCs w:val="20"/>
-        </w:rPr>
-      </w:pPr>
+      <w:hyperlink r:id="rId3">
+        <w:r>
+          <w:rPr>
+            <w:rStyle w:val="Hyperlink"/>
+            <w:rFonts w:ascii="system-ui;Ubuntu;Droid Sans;sans-serif" w:hAnsi="system-ui;Ubuntu;Droid Sans;sans-serif"/>
+            <w:b w:val="false"/>
+            <w:i w:val="false"/>
+            <w:iCs/>
+            <w:caps w:val="false"/>
+            <w:smallCaps w:val="false"/>
+            <w:color w:themeColor="text1" w:val="000000"/>
+            <w:spacing w:val="0"/>
+            <w:sz w:val="20"/>
+            <w:szCs w:val="20"/>
+          </w:rPr>
+          <w:t>{p_three}</w:t>
+        </w:r>
+      </w:hyperlink>
       <w:r>
         <w:rPr>
           <w:i/>
@@ -2522,12 +2516,12 @@
       </w:r>
     </w:p>
     <w:sectPr>
-      <w:headerReference w:type="even" r:id="rId3"/>
-      <w:headerReference w:type="default" r:id="rId4"/>
-      <w:headerReference w:type="first" r:id="rId5"/>
-      <w:footerReference w:type="even" r:id="rId6"/>
-      <w:footerReference w:type="default" r:id="rId7"/>
-      <w:footerReference w:type="first" r:id="rId8"/>
+      <w:headerReference w:type="even" r:id="rId4"/>
+      <w:headerReference w:type="default" r:id="rId5"/>
+      <w:headerReference w:type="first" r:id="rId6"/>
+      <w:footerReference w:type="even" r:id="rId7"/>
+      <w:footerReference w:type="default" r:id="rId8"/>
+      <w:footerReference w:type="first" r:id="rId9"/>
       <w:type w:val="nextPage"/>
       <w:pgSz w:w="11906" w:h="16838"/>
       <w:pgMar w:left="1417" w:right="1417" w:gutter="0" w:header="708" w:top="1417" w:footer="708" w:bottom="1134"/>

</xml_diff>

<commit_message>
[update]: adds counts to page
</commit_message>
<xml_diff>
--- a/templates/proposal-template.docx
+++ b/templates/proposal-template.docx
@@ -2318,10 +2318,25 @@
             <w:spacing w:val="0"/>
             <w:sz w:val="20"/>
             <w:szCs w:val="20"/>
+            <w:u w:val="none"/>
           </w:rPr>
           <w:t>{p_three}</w:t>
         </w:r>
       </w:hyperlink>
+    </w:p>
+    <w:p>
+      <w:pPr>
+        <w:pStyle w:val="Normal"/>
+        <w:spacing w:lineRule="auto" w:line="240"/>
+        <w:rPr>
+          <w:i/>
+          <w:i/>
+          <w:iCs/>
+          <w:color w:val="000000"/>
+          <w:sz w:val="20"/>
+          <w:szCs w:val="20"/>
+        </w:rPr>
+      </w:pPr>
       <w:r>
         <w:rPr>
           <w:i/>

</xml_diff>

<commit_message>
[update]: fixes pricing for exterior views
</commit_message>
<xml_diff>
--- a/templates/proposal-template.docx
+++ b/templates/proposal-template.docx
@@ -1877,51 +1877,11 @@
         </w:rPr>
       </w:pPr>
       <w:r>
-        <w:rPr/>
-      </w:r>
-    </w:p>
-    <w:p>
-      <w:pPr>
-        <w:pStyle w:val="Normal"/>
-        <w:spacing w:lineRule="auto" w:line="240"/>
-        <w:rPr>
-          <w:b/>
-          <w:bCs/>
+        <w:rPr>
           <w:color w:val="000000"/>
           <w:sz w:val="24"/>
           <w:szCs w:val="24"/>
         </w:rPr>
-      </w:pPr>
-      <w:r>
-        <w:rPr>
-          <w:rFonts w:ascii="Ubuntu Mono;Liberation Mono;DejaVu Sans Mono;Courier New;monospace" w:hAnsi="Ubuntu Mono;Liberation Mono;DejaVu Sans Mono;Courier New;monospace"/>
-          <w:b/>
-          <w:bCs/>
-          <w:i w:val="false"/>
-          <w:caps w:val="false"/>
-          <w:smallCaps w:val="false"/>
-          <w:color w:themeColor="text1" w:val="000000"/>
-          <w:spacing w:val="0"/>
-          <w:sz w:val="24"/>
-          <w:szCs w:val="24"/>
-          <w:lang w:val="de-DE"/>
-        </w:rPr>
-        <w:t>{#hasImages}Empfohlene Perspektiven Außen:{/hasImages}</w:t>
-      </w:r>
-      <w:r>
-        <w:rPr>
-          <w:rFonts w:ascii="Ubuntu Mono;Liberation Mono;DejaVu Sans Mono;Courier New;monospace" w:hAnsi="Ubuntu Mono;Liberation Mono;DejaVu Sans Mono;Courier New;monospace"/>
-          <w:b/>
-          <w:bCs/>
-          <w:i w:val="false"/>
-          <w:caps w:val="false"/>
-          <w:smallCaps w:val="false"/>
-          <w:color w:themeColor="text1" w:val="000000"/>
-          <w:spacing w:val="0"/>
-          <w:sz w:val="24"/>
-          <w:szCs w:val="24"/>
-        </w:rPr>
-        <w:t> </w:t>
       </w:r>
     </w:p>
     <w:p>
@@ -1929,7 +1889,6 @@
         <w:pStyle w:val="Normal"/>
         <w:widowControl/>
         <w:spacing w:lineRule="auto" w:line="240" w:before="0" w:after="160"/>
-        <w:jc w:val="center"/>
         <w:rPr>
           <w:rFonts w:ascii="Calibri" w:hAnsi="Calibri" w:eastAsia="Calibri" w:cs="Calibri"/>
           <w:b w:val="false"/>
@@ -1948,8 +1907,8 @@
       <w:r>
         <w:rPr>
           <w:rFonts w:eastAsia="Calibri" w:cs="Calibri"/>
-          <w:b w:val="false"/>
-          <w:bCs w:val="false"/>
+          <w:b/>
+          <w:bCs/>
           <w:i w:val="false"/>
           <w:iCs w:val="false"/>
           <w:caps w:val="false"/>
@@ -1959,7 +1918,39 @@
           <w:szCs w:val="24"/>
           <w:lang w:val="de-DE"/>
         </w:rPr>
-        <w:t>{#images}</w:t>
+        <w:t>{#hasImages}</w:t>
+      </w:r>
+      <w:r>
+        <w:rPr>
+          <w:rFonts w:eastAsia="Calibri" w:cs="Calibri"/>
+          <w:b/>
+          <w:bCs/>
+          <w:i w:val="false"/>
+          <w:iCs w:val="false"/>
+          <w:caps w:val="false"/>
+          <w:smallCaps w:val="false"/>
+          <w:color w:themeColor="text1" w:val="000000"/>
+          <w:sz w:val="24"/>
+          <w:szCs w:val="24"/>
+          <w:lang w:val="de-DE"/>
+        </w:rPr>
+        <w:t>Empfohlene Perspektiven Außen:</w:t>
+      </w:r>
+      <w:r>
+        <w:rPr>
+          <w:rFonts w:eastAsia="Calibri" w:cs="Calibri"/>
+          <w:b/>
+          <w:bCs/>
+          <w:i w:val="false"/>
+          <w:iCs w:val="false"/>
+          <w:caps w:val="false"/>
+          <w:smallCaps w:val="false"/>
+          <w:color w:themeColor="text1" w:val="000000"/>
+          <w:sz w:val="24"/>
+          <w:szCs w:val="24"/>
+          <w:lang w:val="de-DE"/>
+        </w:rPr>
+        <w:t>{/hasImages}</w:t>
       </w:r>
     </w:p>
     <w:p>
@@ -1997,7 +1988,7 @@
           <w:szCs w:val="24"/>
           <w:lang w:val="de-DE"/>
         </w:rPr>
-        <w:t>{@imageXml}</w:t>
+        <w:t>{#images}</w:t>
       </w:r>
     </w:p>
     <w:p>
@@ -2035,27 +2026,30 @@
           <w:szCs w:val="24"/>
           <w:lang w:val="de-DE"/>
         </w:rPr>
-        <w:t>{/images}</w:t>
+        <w:t>{@imageXml}</w:t>
       </w:r>
     </w:p>
     <w:p>
       <w:pPr>
         <w:pStyle w:val="Normal"/>
-        <w:spacing w:lineRule="auto" w:line="240"/>
-        <w:rPr>
-          <w:color w:val="000000"/>
-          <w:sz w:val="24"/>
-          <w:szCs w:val="24"/>
-        </w:rPr>
-      </w:pPr>
-      <w:r>
-        <w:rPr>
+        <w:widowControl/>
+        <w:spacing w:lineRule="auto" w:line="240" w:before="0" w:after="160"/>
+        <w:jc w:val="center"/>
+        <w:rPr>
+          <w:rFonts w:ascii="Calibri" w:hAnsi="Calibri" w:eastAsia="Calibri" w:cs="Calibri"/>
+          <w:b w:val="false"/>
+          <w:bCs w:val="false"/>
+          <w:i w:val="false"/>
+          <w:i w:val="false"/>
+          <w:iCs w:val="false"/>
+          <w:caps w:val="false"/>
+          <w:smallCaps w:val="false"/>
           <w:color w:themeColor="text1" w:val="000000"/>
           <w:sz w:val="24"/>
           <w:szCs w:val="24"/>
-        </w:rPr>
-        <w:t xml:space="preserve">Dieses Angebot ist gültig bis </w:t>
-      </w:r>
+          <w:lang w:val="de-DE"/>
+        </w:rPr>
+      </w:pPr>
       <w:r>
         <w:rPr>
           <w:rFonts w:eastAsia="Calibri" w:cs="Calibri"/>
@@ -2070,6 +2064,41 @@
           <w:szCs w:val="24"/>
           <w:lang w:val="de-DE"/>
         </w:rPr>
+        <w:t>{/images}</w:t>
+      </w:r>
+    </w:p>
+    <w:p>
+      <w:pPr>
+        <w:pStyle w:val="Normal"/>
+        <w:spacing w:lineRule="auto" w:line="240"/>
+        <w:rPr>
+          <w:color w:val="000000"/>
+          <w:sz w:val="24"/>
+          <w:szCs w:val="24"/>
+        </w:rPr>
+      </w:pPr>
+      <w:r>
+        <w:rPr>
+          <w:color w:themeColor="text1" w:val="000000"/>
+          <w:sz w:val="24"/>
+          <w:szCs w:val="24"/>
+        </w:rPr>
+        <w:t xml:space="preserve">Dieses Angebot ist gültig bis </w:t>
+      </w:r>
+      <w:r>
+        <w:rPr>
+          <w:rFonts w:eastAsia="Calibri" w:cs="Calibri"/>
+          <w:b w:val="false"/>
+          <w:bCs w:val="false"/>
+          <w:i w:val="false"/>
+          <w:iCs w:val="false"/>
+          <w:caps w:val="false"/>
+          <w:smallCaps w:val="false"/>
+          <w:color w:themeColor="text1" w:val="000000"/>
+          <w:sz w:val="24"/>
+          <w:szCs w:val="24"/>
+          <w:lang w:val="de-DE"/>
+        </w:rPr>
         <w:t>{offerValidUntil}</w:t>
       </w:r>
     </w:p>
@@ -2311,85 +2340,12 @@
           <w:i/>
           <w:i/>
           <w:iCs/>
-          <w:color w:val="000000"/>
+          <w:color w:themeColor="text1" w:val="000000"/>
           <w:sz w:val="20"/>
           <w:szCs w:val="20"/>
-        </w:rPr>
-      </w:pPr>
-      <w:hyperlink r:id="rId3">
-        <w:r>
-          <w:rPr>
-            <w:rStyle w:val="Hyperlink"/>
-            <w:rFonts w:ascii="system-ui;Ubuntu;Droid Sans;sans-serif" w:hAnsi="system-ui;Ubuntu;Droid Sans;sans-serif"/>
-            <w:b w:val="false"/>
-            <w:i/>
-            <w:iCs/>
-            <w:caps w:val="false"/>
-            <w:smallCaps w:val="false"/>
-            <w:color w:themeColor="text1" w:val="000000"/>
-            <w:spacing w:val="0"/>
-            <w:sz w:val="20"/>
-            <w:szCs w:val="20"/>
-            <w:u w:val="none"/>
-            <w:lang w:val="bg-BG"/>
-          </w:rPr>
-          <w:t>{p_t</w:t>
-        </w:r>
-      </w:hyperlink>
-      <w:r>
-        <w:rPr>
-          <w:rStyle w:val="Hyperlink"/>
-          <w:rFonts w:ascii="system-ui;Ubuntu;Droid Sans;sans-serif" w:hAnsi="system-ui;Ubuntu;Droid Sans;sans-serif"/>
-          <w:b w:val="false"/>
-          <w:i/>
-          <w:iCs/>
-          <w:caps w:val="false"/>
-          <w:smallCaps w:val="false"/>
-          <w:color w:themeColor="text1" w:val="000000"/>
-          <w:spacing w:val="0"/>
-          <w:sz w:val="20"/>
-          <w:szCs w:val="20"/>
-          <w:u w:val="none"/>
           <w:lang w:val="bg-BG"/>
         </w:rPr>
-        <w:t>hree</w:t>
-      </w:r>
-      <w:r>
-        <w:rPr>
-          <w:rStyle w:val="Hyperlink"/>
-          <w:rFonts w:ascii="system-ui;Ubuntu;Droid Sans;sans-serif" w:hAnsi="system-ui;Ubuntu;Droid Sans;sans-serif"/>
-          <w:b w:val="false"/>
-          <w:i/>
-          <w:iCs/>
-          <w:caps w:val="false"/>
-          <w:smallCaps w:val="false"/>
-          <w:color w:themeColor="text1" w:val="000000"/>
-          <w:spacing w:val="0"/>
-          <w:sz w:val="20"/>
-          <w:szCs w:val="20"/>
-          <w:u w:val="none"/>
-          <w:lang w:val="bg-BG"/>
-        </w:rPr>
-        <w:t>}</w:t>
-      </w:r>
-      <w:r>
-        <w:rPr>
-          <w:rStyle w:val="Hyperlink"/>
-          <w:rFonts w:ascii="system-ui;Ubuntu;Droid Sans;sans-serif" w:hAnsi="system-ui;Ubuntu;Droid Sans;sans-serif"/>
-          <w:b w:val="false"/>
-          <w:i/>
-          <w:iCs/>
-          <w:caps w:val="false"/>
-          <w:smallCaps w:val="false"/>
-          <w:color w:themeColor="text1" w:val="000000"/>
-          <w:spacing w:val="0"/>
-          <w:sz w:val="20"/>
-          <w:szCs w:val="20"/>
-          <w:u w:val="none"/>
-          <w:lang w:val="bg-BG"/>
-        </w:rPr>
-        <w:t>{</w:t>
-      </w:r>
+      </w:pPr>
       <w:r>
         <w:rPr>
           <w:i/>
@@ -2397,8 +2353,9 @@
           <w:color w:themeColor="text1" w:val="000000"/>
           <w:sz w:val="20"/>
           <w:szCs w:val="20"/>
-        </w:rPr>
-        <w:t>p_four}</w:t>
+          <w:lang w:val="bg-BG"/>
+        </w:rPr>
+        <w:t>{p_three}{p_four}</w:t>
       </w:r>
     </w:p>
     <w:p>
@@ -2584,12 +2541,12 @@
       </w:r>
     </w:p>
     <w:sectPr>
-      <w:headerReference w:type="even" r:id="rId4"/>
-      <w:headerReference w:type="default" r:id="rId5"/>
-      <w:headerReference w:type="first" r:id="rId6"/>
-      <w:footerReference w:type="even" r:id="rId7"/>
-      <w:footerReference w:type="default" r:id="rId8"/>
-      <w:footerReference w:type="first" r:id="rId9"/>
+      <w:headerReference w:type="even" r:id="rId3"/>
+      <w:headerReference w:type="default" r:id="rId4"/>
+      <w:headerReference w:type="first" r:id="rId5"/>
+      <w:footerReference w:type="even" r:id="rId6"/>
+      <w:footerReference w:type="default" r:id="rId7"/>
+      <w:footerReference w:type="first" r:id="rId8"/>
       <w:type w:val="nextPage"/>
       <w:pgSz w:w="11906" w:h="16838"/>
       <w:pgMar w:left="1417" w:right="1417" w:gutter="0" w:header="708" w:top="1417" w:footer="708" w:bottom="1134"/>

</xml_diff>

<commit_message>
[update]: adds project name for 3d floor plans also
</commit_message>
<xml_diff>
--- a/templates/proposal-template.docx
+++ b/templates/proposal-template.docx
@@ -1869,24 +1869,6 @@
     <w:p>
       <w:pPr>
         <w:pStyle w:val="Normal"/>
-        <w:spacing w:lineRule="auto" w:line="240"/>
-        <w:rPr>
-          <w:color w:val="000000"/>
-          <w:sz w:val="24"/>
-          <w:szCs w:val="24"/>
-        </w:rPr>
-      </w:pPr>
-      <w:r>
-        <w:rPr>
-          <w:color w:val="000000"/>
-          <w:sz w:val="24"/>
-          <w:szCs w:val="24"/>
-        </w:rPr>
-      </w:r>
-    </w:p>
-    <w:p>
-      <w:pPr>
-        <w:pStyle w:val="Normal"/>
         <w:widowControl/>
         <w:spacing w:lineRule="auto" w:line="240" w:before="0" w:after="160"/>
         <w:rPr>
@@ -1920,45 +1902,12 @@
         </w:rPr>
         <w:t>{#hasImages}</w:t>
       </w:r>
-      <w:r>
-        <w:rPr>
-          <w:rFonts w:eastAsia="Calibri" w:cs="Calibri"/>
-          <w:b/>
-          <w:bCs/>
-          <w:i w:val="false"/>
-          <w:iCs w:val="false"/>
-          <w:caps w:val="false"/>
-          <w:smallCaps w:val="false"/>
-          <w:color w:themeColor="text1" w:val="000000"/>
-          <w:sz w:val="24"/>
-          <w:szCs w:val="24"/>
-          <w:lang w:val="de-DE"/>
-        </w:rPr>
-        <w:t>Empfohlene Perspektiven Außen:</w:t>
-      </w:r>
-      <w:r>
-        <w:rPr>
-          <w:rFonts w:eastAsia="Calibri" w:cs="Calibri"/>
-          <w:b/>
-          <w:bCs/>
-          <w:i w:val="false"/>
-          <w:iCs w:val="false"/>
-          <w:caps w:val="false"/>
-          <w:smallCaps w:val="false"/>
-          <w:color w:themeColor="text1" w:val="000000"/>
-          <w:sz w:val="24"/>
-          <w:szCs w:val="24"/>
-          <w:lang w:val="de-DE"/>
-        </w:rPr>
-        <w:t>{/hasImages}</w:t>
-      </w:r>
     </w:p>
     <w:p>
       <w:pPr>
         <w:pStyle w:val="Normal"/>
         <w:widowControl/>
         <w:spacing w:lineRule="auto" w:line="240" w:before="0" w:after="160"/>
-        <w:jc w:val="center"/>
         <w:rPr>
           <w:rFonts w:ascii="Calibri" w:hAnsi="Calibri" w:eastAsia="Calibri" w:cs="Calibri"/>
           <w:b w:val="false"/>
@@ -1977,8 +1926,8 @@
       <w:r>
         <w:rPr>
           <w:rFonts w:eastAsia="Calibri" w:cs="Calibri"/>
-          <w:b w:val="false"/>
-          <w:bCs w:val="false"/>
+          <w:b/>
+          <w:bCs/>
           <w:i w:val="false"/>
           <w:iCs w:val="false"/>
           <w:caps w:val="false"/>
@@ -1988,7 +1937,7 @@
           <w:szCs w:val="24"/>
           <w:lang w:val="de-DE"/>
         </w:rPr>
-        <w:t>{#images}</w:t>
+        <w:t>Empfohlene Perspektiven Außen:{/hasImages}</w:t>
       </w:r>
     </w:p>
     <w:p>
@@ -2026,7 +1975,7 @@
           <w:szCs w:val="24"/>
           <w:lang w:val="de-DE"/>
         </w:rPr>
-        <w:t>{@imageXml}</w:t>
+        <w:t>{#images}</w:t>
       </w:r>
     </w:p>
     <w:p>
@@ -2064,27 +2013,30 @@
           <w:szCs w:val="24"/>
           <w:lang w:val="de-DE"/>
         </w:rPr>
-        <w:t>{/images}</w:t>
+        <w:t>{@imageXml}</w:t>
       </w:r>
     </w:p>
     <w:p>
       <w:pPr>
         <w:pStyle w:val="Normal"/>
-        <w:spacing w:lineRule="auto" w:line="240"/>
-        <w:rPr>
-          <w:color w:val="000000"/>
-          <w:sz w:val="24"/>
-          <w:szCs w:val="24"/>
-        </w:rPr>
-      </w:pPr>
-      <w:r>
-        <w:rPr>
+        <w:widowControl/>
+        <w:spacing w:lineRule="auto" w:line="240" w:before="0" w:after="160"/>
+        <w:jc w:val="center"/>
+        <w:rPr>
+          <w:rFonts w:ascii="Calibri" w:hAnsi="Calibri" w:eastAsia="Calibri" w:cs="Calibri"/>
+          <w:b w:val="false"/>
+          <w:bCs w:val="false"/>
+          <w:i w:val="false"/>
+          <w:i w:val="false"/>
+          <w:iCs w:val="false"/>
+          <w:caps w:val="false"/>
+          <w:smallCaps w:val="false"/>
           <w:color w:themeColor="text1" w:val="000000"/>
           <w:sz w:val="24"/>
           <w:szCs w:val="24"/>
-        </w:rPr>
-        <w:t xml:space="preserve">Dieses Angebot ist gültig bis </w:t>
-      </w:r>
+          <w:lang w:val="de-DE"/>
+        </w:rPr>
+      </w:pPr>
       <w:r>
         <w:rPr>
           <w:rFonts w:eastAsia="Calibri" w:cs="Calibri"/>
@@ -2099,6 +2051,41 @@
           <w:szCs w:val="24"/>
           <w:lang w:val="de-DE"/>
         </w:rPr>
+        <w:t>{/images}</w:t>
+      </w:r>
+    </w:p>
+    <w:p>
+      <w:pPr>
+        <w:pStyle w:val="Normal"/>
+        <w:spacing w:lineRule="auto" w:line="240"/>
+        <w:rPr>
+          <w:color w:val="000000"/>
+          <w:sz w:val="24"/>
+          <w:szCs w:val="24"/>
+        </w:rPr>
+      </w:pPr>
+      <w:r>
+        <w:rPr>
+          <w:color w:themeColor="text1" w:val="000000"/>
+          <w:sz w:val="24"/>
+          <w:szCs w:val="24"/>
+        </w:rPr>
+        <w:t xml:space="preserve">Dieses Angebot ist gültig bis </w:t>
+      </w:r>
+      <w:r>
+        <w:rPr>
+          <w:rFonts w:eastAsia="Calibri" w:cs="Calibri"/>
+          <w:b w:val="false"/>
+          <w:bCs w:val="false"/>
+          <w:i w:val="false"/>
+          <w:iCs w:val="false"/>
+          <w:caps w:val="false"/>
+          <w:smallCaps w:val="false"/>
+          <w:color w:themeColor="text1" w:val="000000"/>
+          <w:sz w:val="24"/>
+          <w:szCs w:val="24"/>
+          <w:lang w:val="de-DE"/>
+        </w:rPr>
         <w:t>{offerValidUntil}</w:t>
       </w:r>
     </w:p>
@@ -2173,7 +2160,26 @@
           <w:sz w:val="24"/>
           <w:szCs w:val="24"/>
         </w:rPr>
-        <w:t>Unterlagen und Informationen{/hasSmallValue}</w:t>
+        <w:t>Unterlagen und Informationen</w:t>
+      </w:r>
+    </w:p>
+    <w:p>
+      <w:pPr>
+        <w:pStyle w:val="Normal"/>
+        <w:spacing w:lineRule="auto" w:line="240"/>
+        <w:rPr>
+          <w:color w:val="000000"/>
+          <w:sz w:val="24"/>
+          <w:szCs w:val="24"/>
+        </w:rPr>
+      </w:pPr>
+      <w:r>
+        <w:rPr>
+          <w:color w:themeColor="text1" w:val="000000"/>
+          <w:sz w:val="24"/>
+          <w:szCs w:val="24"/>
+        </w:rPr>
+        <w:t>{/hasSmallValue}</w:t>
       </w:r>
     </w:p>
     <w:p>
@@ -2231,20 +2237,26 @@
           <w:sz w:val="24"/>
           <w:szCs w:val="24"/>
         </w:rPr>
-        <w:t>Erhalt aller Unterlagen und Informationen{/hasLargeValue}</w:t>
-      </w:r>
-      <w:bookmarkEnd w:id="0"/>
+        <w:t>Erhalt aller Unterlagen und Informationen</w:t>
+      </w:r>
     </w:p>
     <w:p>
       <w:pPr>
         <w:pStyle w:val="Normal"/>
         <w:spacing w:lineRule="auto" w:line="240"/>
         <w:rPr>
-          <w:color w:val="000000"/>
           <w:sz w:val="24"/>
           <w:szCs w:val="24"/>
         </w:rPr>
       </w:pPr>
+      <w:r>
+        <w:rPr>
+          <w:sz w:val="24"/>
+          <w:szCs w:val="24"/>
+        </w:rPr>
+        <w:t>{/hasLargeValue}</w:t>
+      </w:r>
+      <w:bookmarkEnd w:id="0"/>
       <w:r>
         <w:rPr>
           <w:color w:val="000000"/>

</xml_diff>

<commit_message>
[update]: fixes pricing logic accrospages
</commit_message>
<xml_diff>
--- a/templates/proposal-template.docx
+++ b/templates/proposal-template.docx
@@ -1108,6 +1108,134 @@
         </w:tc>
       </w:tr>
       <w:tr>
+        <w:trPr/>
+        <w:tc>
+          <w:tcPr>
+            <w:tcW w:w="993" w:type="dxa"/>
+            <w:tcBorders>
+              <w:left w:val="single" w:sz="4" w:space="0" w:color="000000"/>
+              <w:bottom w:val="single" w:sz="4" w:space="0" w:color="000000"/>
+              <w:right w:val="single" w:sz="4" w:space="0" w:color="000000"/>
+            </w:tcBorders>
+          </w:tcPr>
+          <w:p>
+            <w:pPr>
+              <w:pStyle w:val="Normal"/>
+              <w:spacing w:before="0" w:after="0"/>
+              <w:jc w:val="both"/>
+              <w:rPr>
+                <w:rFonts w:ascii="Calibri" w:hAnsi="Calibri" w:cs="Calibri" w:asciiTheme="minorAscii" w:cstheme="minorAscii" w:hAnsiTheme="minorAscii"/>
+                <w:color w:themeColor="text1" w:val="000000"/>
+                <w:sz w:val="24"/>
+                <w:szCs w:val="24"/>
+              </w:rPr>
+            </w:pPr>
+            <w:r>
+              <w:rPr>
+                <w:rFonts w:cs="Calibri" w:cstheme="minorAscii"/>
+                <w:color w:themeColor="text1" w:val="000000"/>
+                <w:sz w:val="24"/>
+                <w:szCs w:val="24"/>
+              </w:rPr>
+            </w:r>
+          </w:p>
+        </w:tc>
+        <w:tc>
+          <w:tcPr>
+            <w:tcW w:w="1842" w:type="dxa"/>
+            <w:tcBorders>
+              <w:left w:val="single" w:sz="4" w:space="0" w:color="000000"/>
+              <w:bottom w:val="single" w:sz="4" w:space="0" w:color="000000"/>
+              <w:right w:val="single" w:sz="4" w:space="0" w:color="000000"/>
+            </w:tcBorders>
+          </w:tcPr>
+          <w:p>
+            <w:pPr>
+              <w:pStyle w:val="Normal"/>
+              <w:spacing w:before="0" w:after="0"/>
+              <w:rPr>
+                <w:b/>
+                <w:bCs/>
+                <w:color w:themeColor="text1" w:val="000000"/>
+                <w:sz w:val="24"/>
+                <w:szCs w:val="24"/>
+              </w:rPr>
+            </w:pPr>
+            <w:r>
+              <w:rPr>
+                <w:b/>
+                <w:bCs/>
+                <w:color w:themeColor="text1" w:val="000000"/>
+                <w:sz w:val="24"/>
+                <w:szCs w:val="24"/>
+              </w:rPr>
+            </w:r>
+          </w:p>
+        </w:tc>
+        <w:tc>
+          <w:tcPr>
+            <w:tcW w:w="4966" w:type="dxa"/>
+            <w:tcBorders>
+              <w:left w:val="single" w:sz="4" w:space="0" w:color="000000"/>
+              <w:bottom w:val="single" w:sz="4" w:space="0" w:color="000000"/>
+              <w:right w:val="single" w:sz="4" w:space="0" w:color="000000"/>
+            </w:tcBorders>
+          </w:tcPr>
+          <w:p>
+            <w:pPr>
+              <w:pStyle w:val="Normal"/>
+              <w:spacing w:before="0" w:after="0"/>
+              <w:jc w:val="both"/>
+              <w:rPr>
+                <w:color w:themeColor="text1" w:val="000000"/>
+                <w:sz w:val="24"/>
+                <w:szCs w:val="24"/>
+              </w:rPr>
+            </w:pPr>
+            <w:r>
+              <w:rPr>
+                <w:color w:themeColor="text1" w:val="000000"/>
+                <w:sz w:val="24"/>
+                <w:szCs w:val="24"/>
+              </w:rPr>
+            </w:r>
+          </w:p>
+        </w:tc>
+        <w:tc>
+          <w:tcPr>
+            <w:tcW w:w="1270" w:type="dxa"/>
+            <w:tcBorders>
+              <w:left w:val="single" w:sz="4" w:space="0" w:color="000000"/>
+              <w:bottom w:val="single" w:sz="4" w:space="0" w:color="000000"/>
+              <w:right w:val="single" w:sz="4" w:space="0" w:color="000000"/>
+            </w:tcBorders>
+          </w:tcPr>
+          <w:p>
+            <w:pPr>
+              <w:pStyle w:val="Normal"/>
+              <w:spacing w:before="0" w:after="0"/>
+              <w:jc w:val="center"/>
+              <w:rPr>
+                <w:b/>
+                <w:bCs/>
+                <w:color w:themeColor="text1" w:val="000000"/>
+                <w:sz w:val="24"/>
+                <w:szCs w:val="24"/>
+              </w:rPr>
+            </w:pPr>
+            <w:r>
+              <w:rPr>
+                <w:b/>
+                <w:bCs/>
+                <w:color w:themeColor="text1" w:val="000000"/>
+                <w:sz w:val="24"/>
+                <w:szCs w:val="24"/>
+              </w:rPr>
+            </w:r>
+          </w:p>
+        </w:tc>
+      </w:tr>
+      <w:tr>
         <w:trPr>
           <w:trHeight w:val="300" w:hRule="atLeast"/>
         </w:trPr>
@@ -1115,7 +1243,6 @@
           <w:tcPr>
             <w:tcW w:w="993" w:type="dxa"/>
             <w:tcBorders>
-              <w:top w:val="single" w:sz="4" w:space="0" w:color="000000"/>
               <w:left w:val="single" w:sz="4" w:space="0" w:color="000000"/>
               <w:bottom w:val="single" w:sz="4" w:space="0" w:color="000000"/>
               <w:right w:val="single" w:sz="4" w:space="0" w:color="000000"/>
@@ -1145,7 +1272,6 @@
           <w:tcPr>
             <w:tcW w:w="1842" w:type="dxa"/>
             <w:tcBorders>
-              <w:top w:val="single" w:sz="4" w:space="0" w:color="000000"/>
               <w:left w:val="single" w:sz="4" w:space="0" w:color="000000"/>
               <w:bottom w:val="single" w:sz="4" w:space="0" w:color="000000"/>
               <w:right w:val="single" w:sz="4" w:space="0" w:color="000000"/>
@@ -1178,7 +1304,6 @@
           <w:tcPr>
             <w:tcW w:w="4966" w:type="dxa"/>
             <w:tcBorders>
-              <w:top w:val="single" w:sz="4" w:space="0" w:color="000000"/>
               <w:left w:val="single" w:sz="4" w:space="0" w:color="000000"/>
               <w:bottom w:val="single" w:sz="4" w:space="0" w:color="000000"/>
               <w:right w:val="single" w:sz="4" w:space="0" w:color="000000"/>
@@ -1201,6 +1326,7 @@
                 <w:sz w:val="24"/>
                 <w:szCs w:val="24"/>
               </w:rPr>
+              <w:t>{#hasDiscount}Zwischensumme Netto</w:t>
             </w:r>
           </w:p>
         </w:tc>
@@ -1208,29 +1334,25 @@
           <w:tcPr>
             <w:tcW w:w="1270" w:type="dxa"/>
             <w:tcBorders>
-              <w:top w:val="single" w:sz="4" w:space="0" w:color="000000"/>
-              <w:left w:val="single" w:sz="4" w:space="0" w:color="000000"/>
-              <w:bottom w:val="single" w:sz="4" w:space="0" w:color="000000"/>
-              <w:right w:val="single" w:sz="4" w:space="0" w:color="000000"/>
-            </w:tcBorders>
-          </w:tcPr>
-          <w:p>
-            <w:pPr>
-              <w:pStyle w:val="Normal"/>
-              <w:spacing w:before="0" w:after="160"/>
-              <w:jc w:val="center"/>
-              <w:rPr>
-                <w:color w:themeColor="text1" w:val="000000"/>
-                <w:sz w:val="24"/>
-                <w:szCs w:val="24"/>
-              </w:rPr>
-            </w:pPr>
-            <w:r>
-              <w:rPr>
-                <w:color w:themeColor="text1" w:val="000000"/>
-                <w:sz w:val="24"/>
-                <w:szCs w:val="24"/>
-              </w:rPr>
+              <w:left w:val="single" w:sz="4" w:space="0" w:color="000000"/>
+              <w:bottom w:val="single" w:sz="4" w:space="0" w:color="000000"/>
+              <w:right w:val="single" w:sz="4" w:space="0" w:color="000000"/>
+            </w:tcBorders>
+          </w:tcPr>
+          <w:p>
+            <w:pPr>
+              <w:pStyle w:val="Normal"/>
+              <w:spacing w:before="0" w:after="0"/>
+              <w:jc w:val="right"/>
+              <w:rPr>
+                <w:color w:val="000000"/>
+                <w:sz w:val="24"/>
+                <w:szCs w:val="24"/>
+              </w:rPr>
+            </w:pPr>
+            <w:r>
+              <w:rPr/>
+              <w:t>{subtotalNet}€</w:t>
             </w:r>
           </w:p>
         </w:tc>
@@ -1241,7 +1363,6 @@
           <w:tcPr>
             <w:tcW w:w="993" w:type="dxa"/>
             <w:tcBorders>
-              <w:top w:val="single" w:sz="4" w:space="0" w:color="000000"/>
               <w:left w:val="single" w:sz="4" w:space="0" w:color="000000"/>
               <w:bottom w:val="single" w:sz="4" w:space="0" w:color="000000"/>
               <w:right w:val="single" w:sz="4" w:space="0" w:color="000000"/>
@@ -1270,7 +1391,6 @@
           <w:tcPr>
             <w:tcW w:w="1842" w:type="dxa"/>
             <w:tcBorders>
-              <w:top w:val="single" w:sz="4" w:space="0" w:color="000000"/>
               <w:left w:val="single" w:sz="4" w:space="0" w:color="000000"/>
               <w:bottom w:val="single" w:sz="4" w:space="0" w:color="000000"/>
               <w:right w:val="single" w:sz="4" w:space="0" w:color="000000"/>
@@ -1299,7 +1419,6 @@
           <w:tcPr>
             <w:tcW w:w="4966" w:type="dxa"/>
             <w:tcBorders>
-              <w:top w:val="single" w:sz="4" w:space="0" w:color="000000"/>
               <w:left w:val="single" w:sz="4" w:space="0" w:color="000000"/>
               <w:bottom w:val="single" w:sz="4" w:space="0" w:color="000000"/>
               <w:right w:val="single" w:sz="4" w:space="0" w:color="000000"/>
@@ -1310,22 +1429,17 @@
               <w:pStyle w:val="Normal"/>
               <w:spacing w:before="0" w:after="0"/>
               <w:rPr>
-                <w:b/>
-                <w:bCs/>
-                <w:color w:val="000000"/>
-                <w:sz w:val="24"/>
-                <w:szCs w:val="24"/>
-              </w:rPr>
-            </w:pPr>
-            <w:r>
-              <w:rPr>
-                <w:b/>
-                <w:bCs/>
-                <w:color w:val="000000"/>
-                <w:sz w:val="24"/>
-                <w:szCs w:val="24"/>
-              </w:rPr>
-              <w:t>Gesamtpreis Netto</w:t>
+                <w:color w:val="000000"/>
+                <w:sz w:val="24"/>
+                <w:szCs w:val="24"/>
+              </w:rPr>
+            </w:pPr>
+            <w:r>
+              <w:rPr>
+                <w:color w:val="000000"/>
+                <w:sz w:val="24"/>
+                <w:szCs w:val="24"/>
+              </w:rPr>
             </w:r>
           </w:p>
         </w:tc>
@@ -1333,7 +1447,6 @@
           <w:tcPr>
             <w:tcW w:w="1270" w:type="dxa"/>
             <w:tcBorders>
-              <w:top w:val="single" w:sz="4" w:space="0" w:color="000000"/>
               <w:left w:val="single" w:sz="4" w:space="0" w:color="000000"/>
               <w:bottom w:val="single" w:sz="4" w:space="0" w:color="000000"/>
               <w:right w:val="single" w:sz="4" w:space="0" w:color="000000"/>
@@ -1345,14 +1458,65 @@
               <w:spacing w:before="0" w:after="0"/>
               <w:jc w:val="right"/>
               <w:rPr>
-                <w:b/>
-                <w:bCs/>
-                <w:color w:val="000000"/>
-                <w:sz w:val="24"/>
-                <w:szCs w:val="24"/>
-              </w:rPr>
-            </w:pPr>
-            <w:r>
+                <w:color w:val="000000"/>
+                <w:sz w:val="24"/>
+                <w:szCs w:val="24"/>
+              </w:rPr>
+            </w:pPr>
+            <w:r>
+              <w:rPr>
+                <w:color w:val="000000"/>
+                <w:sz w:val="24"/>
+                <w:szCs w:val="24"/>
+              </w:rPr>
+            </w:r>
+          </w:p>
+        </w:tc>
+      </w:tr>
+      <w:tr>
+        <w:trPr/>
+        <w:tc>
+          <w:tcPr>
+            <w:tcW w:w="993" w:type="dxa"/>
+            <w:tcBorders>
+              <w:left w:val="single" w:sz="4" w:space="0" w:color="000000"/>
+              <w:bottom w:val="single" w:sz="4" w:space="0" w:color="000000"/>
+              <w:right w:val="single" w:sz="4" w:space="0" w:color="000000"/>
+            </w:tcBorders>
+          </w:tcPr>
+          <w:p>
+            <w:pPr>
+              <w:pStyle w:val="Normal"/>
+              <w:spacing w:before="0" w:after="160"/>
+              <w:jc w:val="both"/>
+              <w:rPr>
+                <w:color w:themeColor="text1" w:val="000000"/>
+                <w:sz w:val="24"/>
+                <w:szCs w:val="24"/>
+              </w:rPr>
+            </w:pPr>
+            <w:r>
+              <w:rPr>
+                <w:color w:themeColor="text1" w:val="000000"/>
+                <w:sz w:val="24"/>
+                <w:szCs w:val="24"/>
+              </w:rPr>
+            </w:r>
+          </w:p>
+        </w:tc>
+        <w:tc>
+          <w:tcPr>
+            <w:tcW w:w="1842" w:type="dxa"/>
+            <w:tcBorders>
+              <w:left w:val="single" w:sz="4" w:space="0" w:color="000000"/>
+              <w:bottom w:val="single" w:sz="4" w:space="0" w:color="000000"/>
+              <w:right w:val="single" w:sz="4" w:space="0" w:color="000000"/>
+            </w:tcBorders>
+          </w:tcPr>
+          <w:p>
+            <w:pPr>
+              <w:pStyle w:val="Normal"/>
+              <w:spacing w:before="0" w:after="160"/>
               <w:rPr>
                 <w:b/>
                 <w:bCs/>
@@ -1360,7 +1524,331 @@
                 <w:sz w:val="24"/>
                 <w:szCs w:val="24"/>
               </w:rPr>
-              <w:t>{subtotalNet}€</w:t>
+            </w:pPr>
+            <w:r>
+              <w:rPr>
+                <w:b/>
+                <w:bCs/>
+                <w:color w:themeColor="text1" w:val="000000"/>
+                <w:sz w:val="24"/>
+                <w:szCs w:val="24"/>
+              </w:rPr>
+            </w:r>
+          </w:p>
+        </w:tc>
+        <w:tc>
+          <w:tcPr>
+            <w:tcW w:w="4966" w:type="dxa"/>
+            <w:tcBorders>
+              <w:left w:val="single" w:sz="4" w:space="0" w:color="000000"/>
+              <w:bottom w:val="single" w:sz="4" w:space="0" w:color="000000"/>
+              <w:right w:val="single" w:sz="4" w:space="0" w:color="000000"/>
+            </w:tcBorders>
+          </w:tcPr>
+          <w:p>
+            <w:pPr>
+              <w:pStyle w:val="Normal"/>
+              <w:spacing w:before="0" w:after="0"/>
+              <w:rPr>
+                <w:b/>
+                <w:bCs/>
+                <w:color w:val="000000"/>
+                <w:sz w:val="24"/>
+                <w:szCs w:val="24"/>
+              </w:rPr>
+            </w:pPr>
+            <w:r>
+              <w:rPr>
+                <w:b/>
+                <w:bCs/>
+                <w:color w:val="000000"/>
+              </w:rPr>
+              <w:t>{discountDescription}</w:t>
+            </w:r>
+          </w:p>
+        </w:tc>
+        <w:tc>
+          <w:tcPr>
+            <w:tcW w:w="1270" w:type="dxa"/>
+            <w:tcBorders>
+              <w:left w:val="single" w:sz="4" w:space="0" w:color="000000"/>
+              <w:bottom w:val="single" w:sz="4" w:space="0" w:color="000000"/>
+              <w:right w:val="single" w:sz="4" w:space="0" w:color="000000"/>
+            </w:tcBorders>
+          </w:tcPr>
+          <w:p>
+            <w:pPr>
+              <w:pStyle w:val="Normal"/>
+              <w:spacing w:before="0" w:after="0"/>
+              <w:jc w:val="right"/>
+              <w:rPr>
+                <w:b/>
+                <w:bCs/>
+                <w:color w:val="000000"/>
+                <w:sz w:val="24"/>
+                <w:szCs w:val="24"/>
+              </w:rPr>
+            </w:pPr>
+            <w:r>
+              <w:rPr>
+                <w:b/>
+                <w:bCs/>
+              </w:rPr>
+              <w:t>-{discountAmount}</w:t>
+            </w:r>
+            <w:r>
+              <w:rPr>
+                <w:b/>
+                <w:bCs/>
+                <w:color w:themeColor="text1" w:val="000000"/>
+                <w:sz w:val="24"/>
+                <w:szCs w:val="24"/>
+              </w:rPr>
+              <w:t>€</w:t>
+            </w:r>
+          </w:p>
+        </w:tc>
+      </w:tr>
+      <w:tr>
+        <w:trPr/>
+        <w:tc>
+          <w:tcPr>
+            <w:tcW w:w="993" w:type="dxa"/>
+            <w:tcBorders>
+              <w:left w:val="single" w:sz="4" w:space="0" w:color="000000"/>
+              <w:bottom w:val="single" w:sz="4" w:space="0" w:color="000000"/>
+              <w:right w:val="single" w:sz="4" w:space="0" w:color="000000"/>
+            </w:tcBorders>
+          </w:tcPr>
+          <w:p>
+            <w:pPr>
+              <w:pStyle w:val="Normal"/>
+              <w:spacing w:before="0" w:after="0"/>
+              <w:rPr>
+                <w:color w:val="000000"/>
+                <w:sz w:val="24"/>
+                <w:szCs w:val="24"/>
+              </w:rPr>
+            </w:pPr>
+            <w:r>
+              <w:rPr>
+                <w:color w:val="000000"/>
+                <w:sz w:val="24"/>
+                <w:szCs w:val="24"/>
+              </w:rPr>
+            </w:r>
+          </w:p>
+        </w:tc>
+        <w:tc>
+          <w:tcPr>
+            <w:tcW w:w="1842" w:type="dxa"/>
+            <w:tcBorders>
+              <w:left w:val="single" w:sz="4" w:space="0" w:color="000000"/>
+              <w:bottom w:val="single" w:sz="4" w:space="0" w:color="000000"/>
+              <w:right w:val="single" w:sz="4" w:space="0" w:color="000000"/>
+            </w:tcBorders>
+          </w:tcPr>
+          <w:p>
+            <w:pPr>
+              <w:pStyle w:val="Normal"/>
+              <w:spacing w:before="0" w:after="0"/>
+              <w:rPr>
+                <w:color w:val="000000"/>
+                <w:sz w:val="24"/>
+                <w:szCs w:val="24"/>
+              </w:rPr>
+            </w:pPr>
+            <w:r>
+              <w:rPr>
+                <w:color w:val="000000"/>
+                <w:sz w:val="24"/>
+                <w:szCs w:val="24"/>
+              </w:rPr>
+            </w:r>
+          </w:p>
+        </w:tc>
+        <w:tc>
+          <w:tcPr>
+            <w:tcW w:w="4966" w:type="dxa"/>
+            <w:tcBorders>
+              <w:left w:val="single" w:sz="4" w:space="0" w:color="000000"/>
+              <w:bottom w:val="single" w:sz="4" w:space="0" w:color="000000"/>
+              <w:right w:val="single" w:sz="4" w:space="0" w:color="000000"/>
+            </w:tcBorders>
+          </w:tcPr>
+          <w:p>
+            <w:pPr>
+              <w:pStyle w:val="Normal"/>
+              <w:spacing w:before="0" w:after="160"/>
+              <w:jc w:val="both"/>
+              <w:rPr>
+                <w:color w:themeColor="text1" w:val="000000"/>
+                <w:sz w:val="24"/>
+                <w:szCs w:val="24"/>
+              </w:rPr>
+            </w:pPr>
+            <w:r>
+              <w:rPr>
+                <w:color w:themeColor="text1" w:val="000000"/>
+                <w:sz w:val="24"/>
+                <w:szCs w:val="24"/>
+              </w:rPr>
+              <w:t>{/hasDiscount}</w:t>
+            </w:r>
+          </w:p>
+        </w:tc>
+        <w:tc>
+          <w:tcPr>
+            <w:tcW w:w="1270" w:type="dxa"/>
+            <w:tcBorders>
+              <w:left w:val="single" w:sz="4" w:space="0" w:color="000000"/>
+              <w:bottom w:val="single" w:sz="4" w:space="0" w:color="000000"/>
+              <w:right w:val="single" w:sz="4" w:space="0" w:color="000000"/>
+            </w:tcBorders>
+          </w:tcPr>
+          <w:p>
+            <w:pPr>
+              <w:pStyle w:val="Normal"/>
+              <w:spacing w:before="0" w:after="0"/>
+              <w:jc w:val="right"/>
+              <w:rPr>
+                <w:color w:val="000000"/>
+                <w:sz w:val="24"/>
+                <w:szCs w:val="24"/>
+              </w:rPr>
+            </w:pPr>
+            <w:r>
+              <w:rPr>
+                <w:color w:val="000000"/>
+                <w:sz w:val="24"/>
+                <w:szCs w:val="24"/>
+              </w:rPr>
+            </w:r>
+          </w:p>
+        </w:tc>
+      </w:tr>
+      <w:tr>
+        <w:trPr/>
+        <w:tc>
+          <w:tcPr>
+            <w:tcW w:w="993" w:type="dxa"/>
+            <w:tcBorders>
+              <w:left w:val="single" w:sz="4" w:space="0" w:color="000000"/>
+              <w:bottom w:val="single" w:sz="4" w:space="0" w:color="000000"/>
+              <w:right w:val="single" w:sz="4" w:space="0" w:color="000000"/>
+            </w:tcBorders>
+          </w:tcPr>
+          <w:p>
+            <w:pPr>
+              <w:pStyle w:val="Normal"/>
+              <w:spacing w:before="0" w:after="0"/>
+              <w:rPr>
+                <w:color w:val="000000"/>
+                <w:sz w:val="24"/>
+                <w:szCs w:val="24"/>
+              </w:rPr>
+            </w:pPr>
+            <w:r>
+              <w:rPr>
+                <w:color w:val="000000"/>
+                <w:sz w:val="24"/>
+                <w:szCs w:val="24"/>
+              </w:rPr>
+            </w:r>
+          </w:p>
+        </w:tc>
+        <w:tc>
+          <w:tcPr>
+            <w:tcW w:w="1842" w:type="dxa"/>
+            <w:tcBorders>
+              <w:left w:val="single" w:sz="4" w:space="0" w:color="000000"/>
+              <w:bottom w:val="single" w:sz="4" w:space="0" w:color="000000"/>
+              <w:right w:val="single" w:sz="4" w:space="0" w:color="000000"/>
+            </w:tcBorders>
+          </w:tcPr>
+          <w:p>
+            <w:pPr>
+              <w:pStyle w:val="Normal"/>
+              <w:spacing w:before="0" w:after="0"/>
+              <w:rPr>
+                <w:color w:val="000000"/>
+                <w:sz w:val="24"/>
+                <w:szCs w:val="24"/>
+              </w:rPr>
+            </w:pPr>
+            <w:r>
+              <w:rPr>
+                <w:color w:val="000000"/>
+                <w:sz w:val="24"/>
+                <w:szCs w:val="24"/>
+              </w:rPr>
+            </w:r>
+          </w:p>
+        </w:tc>
+        <w:tc>
+          <w:tcPr>
+            <w:tcW w:w="4966" w:type="dxa"/>
+            <w:tcBorders>
+              <w:left w:val="single" w:sz="4" w:space="0" w:color="000000"/>
+              <w:bottom w:val="single" w:sz="4" w:space="0" w:color="000000"/>
+              <w:right w:val="single" w:sz="4" w:space="0" w:color="000000"/>
+            </w:tcBorders>
+          </w:tcPr>
+          <w:p>
+            <w:pPr>
+              <w:pStyle w:val="Normal"/>
+              <w:spacing w:before="0" w:after="0"/>
+              <w:rPr>
+                <w:b/>
+                <w:bCs/>
+                <w:color w:val="000000"/>
+                <w:sz w:val="24"/>
+                <w:szCs w:val="24"/>
+              </w:rPr>
+            </w:pPr>
+            <w:r>
+              <w:rPr>
+                <w:b/>
+                <w:bCs/>
+                <w:color w:val="000000"/>
+                <w:sz w:val="24"/>
+                <w:szCs w:val="24"/>
+              </w:rPr>
+              <w:t>Gesamtpreis Netto</w:t>
+            </w:r>
+          </w:p>
+        </w:tc>
+        <w:tc>
+          <w:tcPr>
+            <w:tcW w:w="1270" w:type="dxa"/>
+            <w:tcBorders>
+              <w:left w:val="single" w:sz="4" w:space="0" w:color="000000"/>
+              <w:bottom w:val="single" w:sz="4" w:space="0" w:color="000000"/>
+              <w:right w:val="single" w:sz="4" w:space="0" w:color="000000"/>
+            </w:tcBorders>
+          </w:tcPr>
+          <w:p>
+            <w:pPr>
+              <w:pStyle w:val="Normal"/>
+              <w:spacing w:before="0" w:after="0"/>
+              <w:jc w:val="right"/>
+              <w:rPr>
+                <w:b/>
+                <w:bCs/>
+                <w:color w:val="000000"/>
+                <w:sz w:val="24"/>
+                <w:szCs w:val="24"/>
+              </w:rPr>
+            </w:pPr>
+            <w:r>
+              <w:rPr>
+                <w:b/>
+                <w:bCs/>
+                <w:color w:themeColor="text1" w:val="000000"/>
+                <w:sz w:val="24"/>
+                <w:szCs w:val="24"/>
+              </w:rPr>
+              <w:t>{totalNetPrice}€</w:t>
             </w:r>
           </w:p>
         </w:tc>

</xml_diff>

<commit_message>
[update]: fixes indentation issues
</commit_message>
<xml_diff>
--- a/templates/proposal-template.docx
+++ b/templates/proposal-template.docx
@@ -960,7 +960,7 @@
                 <w:sz w:val="24"/>
                 <w:szCs w:val="24"/>
               </w:rPr>
-              <w:t>{unitPrice}</w:t>
+              <w:t>{unitPrice} €</w:t>
             </w:r>
           </w:p>
         </w:tc>
@@ -1352,7 +1352,7 @@
             </w:pPr>
             <w:r>
               <w:rPr/>
-              <w:t>{subtotalNet}€</w:t>
+              <w:t>{subtotalNet} €</w:t>
             </w:r>
           </w:p>
         </w:tc>
@@ -1594,7 +1594,7 @@
                 <w:b/>
                 <w:bCs/>
               </w:rPr>
-              <w:t>-{discountAmount}</w:t>
+              <w:t xml:space="preserve">-{discountAmount} </w:t>
             </w:r>
             <w:r>
               <w:rPr>
@@ -1848,7 +1848,7 @@
                 <w:sz w:val="24"/>
                 <w:szCs w:val="24"/>
               </w:rPr>
-              <w:t>{totalNetPrice}€</w:t>
+              <w:t>{totalNetPrice} €</w:t>
             </w:r>
           </w:p>
         </w:tc>
@@ -2098,7 +2098,7 @@
                 <w:sz w:val="24"/>
                 <w:szCs w:val="24"/>
               </w:rPr>
-              <w:t>{totalVat}€</w:t>
+              <w:t>{totalVat} €</w:t>
             </w:r>
           </w:p>
         </w:tc>
@@ -2228,7 +2228,7 @@
                 <w:sz w:val="24"/>
                 <w:szCs w:val="24"/>
               </w:rPr>
-              <w:t>{totalGrossPrice}€</w:t>
+              <w:t>{totalGrossPrice} €</w:t>
             </w:r>
           </w:p>
         </w:tc>

</xml_diff>

<commit_message>
[update]: fixes template file
</commit_message>
<xml_diff>
--- a/templates/proposal-template.docx
+++ b/templates/proposal-template.docx
@@ -1550,51 +1550,59 @@
               <w:pStyle w:val="Normal"/>
               <w:spacing w:before="0" w:after="0"/>
               <w:rPr>
+                <w:sz w:val="24"/>
+                <w:szCs w:val="24"/>
+              </w:rPr>
+            </w:pPr>
+            <w:r>
+              <w:rPr>
                 <w:b/>
                 <w:bCs/>
                 <w:color w:val="000000"/>
                 <w:sz w:val="24"/>
                 <w:szCs w:val="24"/>
               </w:rPr>
-            </w:pPr>
-            <w:r>
+              <w:t>{discountDescription}</w:t>
+            </w:r>
+          </w:p>
+        </w:tc>
+        <w:tc>
+          <w:tcPr>
+            <w:tcW w:w="1270" w:type="dxa"/>
+            <w:tcBorders>
+              <w:left w:val="single" w:sz="4" w:space="0" w:color="000000"/>
+              <w:bottom w:val="single" w:sz="4" w:space="0" w:color="000000"/>
+              <w:right w:val="single" w:sz="4" w:space="0" w:color="000000"/>
+            </w:tcBorders>
+          </w:tcPr>
+          <w:p>
+            <w:pPr>
+              <w:pStyle w:val="Normal"/>
+              <w:spacing w:before="0" w:after="0"/>
+              <w:jc w:val="right"/>
               <w:rPr>
                 <w:b/>
                 <w:bCs/>
                 <w:color w:val="000000"/>
-              </w:rPr>
-              <w:t>{discountDescription}</w:t>
-            </w:r>
-          </w:p>
-        </w:tc>
-        <w:tc>
-          <w:tcPr>
-            <w:tcW w:w="1270" w:type="dxa"/>
-            <w:tcBorders>
-              <w:left w:val="single" w:sz="4" w:space="0" w:color="000000"/>
-              <w:bottom w:val="single" w:sz="4" w:space="0" w:color="000000"/>
-              <w:right w:val="single" w:sz="4" w:space="0" w:color="000000"/>
-            </w:tcBorders>
-          </w:tcPr>
-          <w:p>
-            <w:pPr>
-              <w:pStyle w:val="Normal"/>
-              <w:spacing w:before="0" w:after="0"/>
-              <w:jc w:val="right"/>
+                <w:sz w:val="24"/>
+                <w:szCs w:val="24"/>
+              </w:rPr>
+            </w:pPr>
+            <w:r>
               <w:rPr>
                 <w:b/>
                 <w:bCs/>
-                <w:color w:val="000000"/>
-                <w:sz w:val="24"/>
-                <w:szCs w:val="24"/>
-              </w:rPr>
-            </w:pPr>
+              </w:rPr>
+              <w:t>-</w:t>
+            </w:r>
             <w:r>
               <w:rPr>
                 <w:b/>
                 <w:bCs/>
-              </w:rPr>
-              <w:t xml:space="preserve">-{discountAmount} </w:t>
+                <w:sz w:val="24"/>
+                <w:szCs w:val="24"/>
+              </w:rPr>
+              <w:t xml:space="preserve">{discountAmount} </w:t>
             </w:r>
             <w:r>
               <w:rPr>

</xml_diff>

<commit_message>
[fix]: bug fixes in the proposal automation
</commit_message>
<xml_diff>
--- a/templates/proposal-template.docx
+++ b/templates/proposal-template.docx
@@ -1312,13 +1312,9 @@
           <w:p>
             <w:pPr>
               <w:pStyle w:val="Normal"/>
-              <w:spacing w:before="0" w:after="160"/>
+              <w:spacing w:lineRule="auto" w:line="240" w:before="0" w:afterAutospacing="0" w:after="0"/>
               <w:jc w:val="both"/>
-              <w:rPr>
-                <w:color w:themeColor="text1" w:val="000000"/>
-                <w:sz w:val="24"/>
-                <w:szCs w:val="24"/>
-              </w:rPr>
+              <w:rPr/>
             </w:pPr>
             <w:r>
               <w:rPr>
@@ -1351,7 +1347,10 @@
               </w:rPr>
             </w:pPr>
             <w:r>
-              <w:rPr/>
+              <w:rPr>
+                <w:sz w:val="24"/>
+                <w:szCs w:val="24"/>
+              </w:rPr>
               <w:t>{subtotalNet} €</w:t>
             </w:r>
           </w:p>
@@ -1487,7 +1486,7 @@
           <w:p>
             <w:pPr>
               <w:pStyle w:val="Normal"/>
-              <w:spacing w:before="0" w:after="160"/>
+              <w:spacing w:before="0" w:afterAutospacing="0" w:after="0"/>
               <w:jc w:val="both"/>
               <w:rPr>
                 <w:color w:themeColor="text1" w:val="000000"/>
@@ -1516,7 +1515,7 @@
           <w:p>
             <w:pPr>
               <w:pStyle w:val="Normal"/>
-              <w:spacing w:before="0" w:after="160"/>
+              <w:spacing w:before="0" w:afterAutospacing="0" w:after="0"/>
               <w:rPr>
                 <w:b/>
                 <w:bCs/>
@@ -1548,62 +1547,12 @@
           <w:p>
             <w:pPr>
               <w:pStyle w:val="Normal"/>
-              <w:spacing w:before="0" w:after="0"/>
-              <w:rPr>
-                <w:sz w:val="24"/>
-                <w:szCs w:val="24"/>
-              </w:rPr>
-            </w:pPr>
-            <w:r>
-              <w:rPr>
-                <w:b/>
-                <w:bCs/>
-                <w:color w:val="000000"/>
-                <w:sz w:val="24"/>
-                <w:szCs w:val="24"/>
-              </w:rPr>
-              <w:t>{discountDescription}</w:t>
-            </w:r>
-          </w:p>
-        </w:tc>
-        <w:tc>
-          <w:tcPr>
-            <w:tcW w:w="1270" w:type="dxa"/>
-            <w:tcBorders>
-              <w:left w:val="single" w:sz="4" w:space="0" w:color="000000"/>
-              <w:bottom w:val="single" w:sz="4" w:space="0" w:color="000000"/>
-              <w:right w:val="single" w:sz="4" w:space="0" w:color="000000"/>
-            </w:tcBorders>
-          </w:tcPr>
-          <w:p>
-            <w:pPr>
-              <w:pStyle w:val="Normal"/>
-              <w:spacing w:before="0" w:after="0"/>
-              <w:jc w:val="right"/>
-              <w:rPr>
-                <w:b/>
-                <w:bCs/>
-                <w:color w:val="000000"/>
-                <w:sz w:val="24"/>
-                <w:szCs w:val="24"/>
-              </w:rPr>
-            </w:pPr>
-            <w:r>
-              <w:rPr>
-                <w:b/>
-                <w:bCs/>
-              </w:rPr>
-              <w:t>-</w:t>
-            </w:r>
-            <w:r>
-              <w:rPr>
-                <w:b/>
-                <w:bCs/>
-                <w:sz w:val="24"/>
-                <w:szCs w:val="24"/>
-              </w:rPr>
-              <w:t xml:space="preserve">{discountAmount} </w:t>
-            </w:r>
+              <w:spacing w:before="0" w:afterAutospacing="0" w:after="0"/>
+              <w:rPr>
+                <w:sz w:val="24"/>
+                <w:szCs w:val="24"/>
+              </w:rPr>
+            </w:pPr>
             <w:r>
               <w:rPr>
                 <w:b/>
@@ -1612,6 +1561,49 @@
                 <w:sz w:val="24"/>
                 <w:szCs w:val="24"/>
               </w:rPr>
+              <w:t>{discountDescription}</w:t>
+            </w:r>
+          </w:p>
+        </w:tc>
+        <w:tc>
+          <w:tcPr>
+            <w:tcW w:w="1270" w:type="dxa"/>
+            <w:tcBorders>
+              <w:left w:val="single" w:sz="4" w:space="0" w:color="000000"/>
+              <w:bottom w:val="single" w:sz="4" w:space="0" w:color="000000"/>
+              <w:right w:val="single" w:sz="4" w:space="0" w:color="000000"/>
+            </w:tcBorders>
+          </w:tcPr>
+          <w:p>
+            <w:pPr>
+              <w:pStyle w:val="Normal"/>
+              <w:spacing w:before="0" w:afterAutospacing="0" w:after="0"/>
+              <w:jc w:val="right"/>
+              <w:rPr>
+                <w:b/>
+                <w:bCs/>
+                <w:color w:val="000000"/>
+                <w:sz w:val="24"/>
+                <w:szCs w:val="24"/>
+              </w:rPr>
+            </w:pPr>
+            <w:r>
+              <w:rPr>
+                <w:b/>
+                <w:bCs/>
+                <w:sz w:val="24"/>
+                <w:szCs w:val="24"/>
+              </w:rPr>
+              <w:t xml:space="preserve">-{discountAmount} </w:t>
+            </w:r>
+            <w:r>
+              <w:rPr>
+                <w:b/>
+                <w:bCs/>
+                <w:color w:themeColor="text1" w:val="000000"/>
+                <w:sz w:val="24"/>
+                <w:szCs w:val="24"/>
+              </w:rPr>
               <w:t>€</w:t>
             </w:r>
           </w:p>
@@ -1687,7 +1679,7 @@
           <w:p>
             <w:pPr>
               <w:pStyle w:val="Normal"/>
-              <w:spacing w:before="0" w:after="160"/>
+              <w:spacing w:before="0" w:afterAutospacing="0" w:after="0"/>
               <w:jc w:val="both"/>
               <w:rPr>
                 <w:color w:themeColor="text1" w:val="000000"/>
@@ -2222,14 +2214,6 @@
                 <w:szCs w:val="24"/>
               </w:rPr>
             </w:pPr>
-            <w:r>
-              <w:rPr>
-                <w:color w:themeColor="text1" w:val="000000"/>
-                <w:sz w:val="24"/>
-                <w:szCs w:val="24"/>
-              </w:rPr>
-              <w:t xml:space="preserve"> </w:t>
-            </w:r>
             <w:r>
               <w:rPr>
                 <w:color w:themeColor="text1" w:val="000000"/>

</xml_diff>

<commit_message>
[update]: removed the extra spaces in the sumary page
</commit_message>
<xml_diff>
--- a/templates/proposal-template.docx
+++ b/templates/proposal-template.docx
@@ -597,8 +597,8 @@
       <w:tblGrid>
         <w:gridCol w:w="915"/>
         <w:gridCol w:w="1800"/>
-        <w:gridCol w:w="4770"/>
-        <w:gridCol w:w="1586"/>
+        <w:gridCol w:w="4771"/>
+        <w:gridCol w:w="1585"/>
       </w:tblGrid>
       <w:tr>
         <w:trPr>
@@ -670,7 +670,7 @@
         </w:tc>
         <w:tc>
           <w:tcPr>
-            <w:tcW w:w="4770" w:type="dxa"/>
+            <w:tcW w:w="4771" w:type="dxa"/>
             <w:tcBorders>
               <w:top w:val="single" w:sz="4" w:space="0" w:color="000000"/>
               <w:left w:val="single" w:sz="4" w:space="0" w:color="000000"/>
@@ -702,7 +702,7 @@
         </w:tc>
         <w:tc>
           <w:tcPr>
-            <w:tcW w:w="1586" w:type="dxa"/>
+            <w:tcW w:w="1585" w:type="dxa"/>
             <w:tcBorders>
               <w:top w:val="single" w:sz="4" w:space="0" w:color="000000"/>
               <w:left w:val="single" w:sz="4" w:space="0" w:color="000000"/>
@@ -877,7 +877,7 @@
         </w:tc>
         <w:tc>
           <w:tcPr>
-            <w:tcW w:w="4770" w:type="dxa"/>
+            <w:tcW w:w="4771" w:type="dxa"/>
             <w:tcBorders>
               <w:top w:val="single" w:sz="4" w:space="0" w:color="000000"/>
               <w:left w:val="single" w:sz="4" w:space="0" w:color="000000"/>
@@ -931,7 +931,7 @@
         </w:tc>
         <w:tc>
           <w:tcPr>
-            <w:tcW w:w="1586" w:type="dxa"/>
+            <w:tcW w:w="1585" w:type="dxa"/>
             <w:tcBorders>
               <w:top w:val="single" w:sz="4" w:space="0" w:color="000000"/>
               <w:left w:val="single" w:sz="4" w:space="0" w:color="000000"/>
@@ -1034,7 +1034,7 @@
         </w:tc>
         <w:tc>
           <w:tcPr>
-            <w:tcW w:w="4770" w:type="dxa"/>
+            <w:tcW w:w="4771" w:type="dxa"/>
             <w:tcBorders>
               <w:top w:val="single" w:sz="4" w:space="0" w:color="000000"/>
               <w:left w:val="single" w:sz="4" w:space="0" w:color="000000"/>
@@ -1065,7 +1065,7 @@
         </w:tc>
         <w:tc>
           <w:tcPr>
-            <w:tcW w:w="1586" w:type="dxa"/>
+            <w:tcW w:w="1585" w:type="dxa"/>
             <w:tcBorders>
               <w:top w:val="single" w:sz="4" w:space="0" w:color="000000"/>
               <w:left w:val="single" w:sz="4" w:space="0" w:color="000000"/>
@@ -1174,7 +1174,7 @@
         </w:tc>
         <w:tc>
           <w:tcPr>
-            <w:tcW w:w="4770" w:type="dxa"/>
+            <w:tcW w:w="4771" w:type="dxa"/>
             <w:tcBorders>
               <w:left w:val="single" w:sz="4" w:space="0" w:color="000000"/>
               <w:bottom w:val="single" w:sz="4" w:space="0" w:color="000000"/>
@@ -1203,7 +1203,7 @@
         </w:tc>
         <w:tc>
           <w:tcPr>
-            <w:tcW w:w="1586" w:type="dxa"/>
+            <w:tcW w:w="1585" w:type="dxa"/>
             <w:tcBorders>
               <w:left w:val="single" w:sz="4" w:space="0" w:color="000000"/>
               <w:bottom w:val="single" w:sz="4" w:space="0" w:color="000000"/>
@@ -1302,7 +1302,7 @@
         </w:tc>
         <w:tc>
           <w:tcPr>
-            <w:tcW w:w="4770" w:type="dxa"/>
+            <w:tcW w:w="4771" w:type="dxa"/>
             <w:tcBorders>
               <w:left w:val="single" w:sz="4" w:space="0" w:color="000000"/>
               <w:bottom w:val="single" w:sz="4" w:space="0" w:color="000000"/>
@@ -1324,7 +1324,7 @@
         </w:tc>
         <w:tc>
           <w:tcPr>
-            <w:tcW w:w="1586" w:type="dxa"/>
+            <w:tcW w:w="1585" w:type="dxa"/>
             <w:tcBorders>
               <w:left w:val="single" w:sz="4" w:space="0" w:color="000000"/>
               <w:bottom w:val="single" w:sz="4" w:space="0" w:color="000000"/>
@@ -1420,7 +1420,7 @@
         </w:tc>
         <w:tc>
           <w:tcPr>
-            <w:tcW w:w="4770" w:type="dxa"/>
+            <w:tcW w:w="4771" w:type="dxa"/>
             <w:tcBorders>
               <w:left w:val="single" w:sz="4" w:space="0" w:color="000000"/>
               <w:bottom w:val="single" w:sz="4" w:space="0" w:color="000000"/>
@@ -1448,7 +1448,7 @@
         </w:tc>
         <w:tc>
           <w:tcPr>
-            <w:tcW w:w="1586" w:type="dxa"/>
+            <w:tcW w:w="1585" w:type="dxa"/>
             <w:tcBorders>
               <w:left w:val="single" w:sz="4" w:space="0" w:color="000000"/>
               <w:bottom w:val="single" w:sz="4" w:space="0" w:color="000000"/>
@@ -1541,7 +1541,7 @@
         </w:tc>
         <w:tc>
           <w:tcPr>
-            <w:tcW w:w="4770" w:type="dxa"/>
+            <w:tcW w:w="4771" w:type="dxa"/>
             <w:tcBorders>
               <w:left w:val="single" w:sz="4" w:space="0" w:color="000000"/>
               <w:bottom w:val="single" w:sz="4" w:space="0" w:color="000000"/>
@@ -1571,7 +1571,7 @@
         </w:tc>
         <w:tc>
           <w:tcPr>
-            <w:tcW w:w="1586" w:type="dxa"/>
+            <w:tcW w:w="1585" w:type="dxa"/>
             <w:tcBorders>
               <w:left w:val="single" w:sz="4" w:space="0" w:color="000000"/>
               <w:bottom w:val="single" w:sz="4" w:space="0" w:color="000000"/>
@@ -1673,7 +1673,7 @@
         </w:tc>
         <w:tc>
           <w:tcPr>
-            <w:tcW w:w="4770" w:type="dxa"/>
+            <w:tcW w:w="4771" w:type="dxa"/>
             <w:tcBorders>
               <w:left w:val="single" w:sz="4" w:space="0" w:color="000000"/>
               <w:bottom w:val="single" w:sz="4" w:space="0" w:color="000000"/>
@@ -1703,7 +1703,7 @@
         </w:tc>
         <w:tc>
           <w:tcPr>
-            <w:tcW w:w="1586" w:type="dxa"/>
+            <w:tcW w:w="1585" w:type="dxa"/>
             <w:tcBorders>
               <w:left w:val="single" w:sz="4" w:space="0" w:color="000000"/>
               <w:bottom w:val="single" w:sz="4" w:space="0" w:color="000000"/>
@@ -1791,7 +1791,7 @@
         </w:tc>
         <w:tc>
           <w:tcPr>
-            <w:tcW w:w="4770" w:type="dxa"/>
+            <w:tcW w:w="4771" w:type="dxa"/>
             <w:tcBorders>
               <w:left w:val="single" w:sz="4" w:space="0" w:color="000000"/>
               <w:bottom w:val="single" w:sz="4" w:space="0" w:color="000000"/>
@@ -1824,7 +1824,7 @@
         </w:tc>
         <w:tc>
           <w:tcPr>
-            <w:tcW w:w="1586" w:type="dxa"/>
+            <w:tcW w:w="1585" w:type="dxa"/>
             <w:tcBorders>
               <w:left w:val="single" w:sz="4" w:space="0" w:color="000000"/>
               <w:bottom w:val="single" w:sz="4" w:space="0" w:color="000000"/>
@@ -1919,7 +1919,7 @@
         </w:tc>
         <w:tc>
           <w:tcPr>
-            <w:tcW w:w="4770" w:type="dxa"/>
+            <w:tcW w:w="4771" w:type="dxa"/>
             <w:tcBorders>
               <w:top w:val="single" w:sz="4" w:space="0" w:color="000000"/>
               <w:left w:val="single" w:sz="4" w:space="0" w:color="000000"/>
@@ -1948,7 +1948,7 @@
         </w:tc>
         <w:tc>
           <w:tcPr>
-            <w:tcW w:w="1586" w:type="dxa"/>
+            <w:tcW w:w="1585" w:type="dxa"/>
             <w:tcBorders>
               <w:top w:val="single" w:sz="4" w:space="0" w:color="000000"/>
               <w:left w:val="single" w:sz="4" w:space="0" w:color="000000"/>
@@ -2039,7 +2039,7 @@
         </w:tc>
         <w:tc>
           <w:tcPr>
-            <w:tcW w:w="4770" w:type="dxa"/>
+            <w:tcW w:w="4771" w:type="dxa"/>
             <w:tcBorders>
               <w:top w:val="single" w:sz="4" w:space="0" w:color="000000"/>
               <w:left w:val="single" w:sz="4" w:space="0" w:color="000000"/>
@@ -2069,7 +2069,7 @@
         </w:tc>
         <w:tc>
           <w:tcPr>
-            <w:tcW w:w="1586" w:type="dxa"/>
+            <w:tcW w:w="1585" w:type="dxa"/>
             <w:tcBorders>
               <w:top w:val="single" w:sz="4" w:space="0" w:color="000000"/>
               <w:left w:val="single" w:sz="4" w:space="0" w:color="000000"/>
@@ -2169,7 +2169,7 @@
         </w:tc>
         <w:tc>
           <w:tcPr>
-            <w:tcW w:w="4770" w:type="dxa"/>
+            <w:tcW w:w="4771" w:type="dxa"/>
             <w:tcBorders>
               <w:top w:val="single" w:sz="4" w:space="0" w:color="000000"/>
               <w:left w:val="single" w:sz="4" w:space="0" w:color="000000"/>
@@ -2199,7 +2199,7 @@
         </w:tc>
         <w:tc>
           <w:tcPr>
-            <w:tcW w:w="1586" w:type="dxa"/>
+            <w:tcW w:w="1585" w:type="dxa"/>
             <w:tcBorders>
               <w:top w:val="single" w:sz="4" w:space="0" w:color="000000"/>
               <w:left w:val="single" w:sz="4" w:space="0" w:color="000000"/>
@@ -2291,7 +2291,7 @@
         </w:tc>
         <w:tc>
           <w:tcPr>
-            <w:tcW w:w="4770" w:type="dxa"/>
+            <w:tcW w:w="4771" w:type="dxa"/>
             <w:tcBorders>
               <w:top w:val="single" w:sz="4" w:space="0" w:color="000000"/>
               <w:left w:val="single" w:sz="4" w:space="0" w:color="000000"/>
@@ -2320,7 +2320,7 @@
         </w:tc>
         <w:tc>
           <w:tcPr>
-            <w:tcW w:w="1586" w:type="dxa"/>
+            <w:tcW w:w="1585" w:type="dxa"/>
             <w:tcBorders>
               <w:top w:val="single" w:sz="4" w:space="0" w:color="000000"/>
               <w:left w:val="single" w:sz="4" w:space="0" w:color="000000"/>
@@ -2931,7 +2931,7 @@
     <w:p>
       <w:pPr>
         <w:pStyle w:val="Normal"/>
-        <w:spacing w:lineRule="auto" w:line="240"/>
+        <w:spacing w:lineRule="auto" w:line="240" w:before="0" w:after="160"/>
         <w:rPr>
           <w:i/>
           <w:i/>
@@ -2952,88 +2952,6 @@
           <w:lang w:val="bg-BG"/>
         </w:rPr>
         <w:t>{p_eight}</w:t>
-      </w:r>
-    </w:p>
-    <w:p>
-      <w:pPr>
-        <w:pStyle w:val="Normal"/>
-        <w:spacing w:lineRule="auto" w:line="240"/>
-        <w:rPr>
-          <w:i/>
-          <w:i/>
-          <w:iCs/>
-          <w:color w:val="000000"/>
-          <w:sz w:val="20"/>
-          <w:szCs w:val="20"/>
-          <w:lang w:val="bg-BG"/>
-        </w:rPr>
-      </w:pPr>
-      <w:r>
-        <w:rPr>
-          <w:i/>
-          <w:iCs/>
-          <w:color w:val="000000"/>
-          <w:sz w:val="20"/>
-          <w:szCs w:val="20"/>
-          <w:lang w:val="bg-BG"/>
-        </w:rPr>
-      </w:r>
-    </w:p>
-    <w:p>
-      <w:pPr>
-        <w:pStyle w:val="Normal"/>
-        <w:spacing w:lineRule="auto" w:line="240"/>
-        <w:rPr>
-          <w:i/>
-          <w:i/>
-          <w:iCs/>
-          <w:color w:val="000000"/>
-          <w:sz w:val="20"/>
-          <w:szCs w:val="20"/>
-          <w:lang w:val="bg-BG"/>
-        </w:rPr>
-      </w:pPr>
-      <w:r>
-        <w:rPr>
-          <w:i/>
-          <w:iCs/>
-          <w:color w:val="000000"/>
-          <w:sz w:val="20"/>
-          <w:szCs w:val="20"/>
-          <w:lang w:val="bg-BG"/>
-        </w:rPr>
-      </w:r>
-    </w:p>
-    <w:p>
-      <w:pPr>
-        <w:pStyle w:val="Normal"/>
-        <w:rPr/>
-      </w:pPr>
-      <w:r>
-        <w:rPr/>
-      </w:r>
-    </w:p>
-    <w:p>
-      <w:pPr>
-        <w:pStyle w:val="Normal"/>
-        <w:spacing w:lineRule="auto" w:line="240" w:before="0" w:after="160"/>
-        <w:rPr>
-          <w:i/>
-          <w:i/>
-          <w:iCs/>
-          <w:color w:val="000000"/>
-          <w:sz w:val="20"/>
-          <w:szCs w:val="20"/>
-        </w:rPr>
-      </w:pPr>
-      <w:r>
-        <w:rPr>
-          <w:i/>
-          <w:iCs/>
-          <w:color w:val="000000"/>
-          <w:sz w:val="20"/>
-          <w:szCs w:val="20"/>
-        </w:rPr>
       </w:r>
     </w:p>
     <w:sectPr>

</xml_diff>

<commit_message>
[update]: changed text to calibri 11 font size
</commit_message>
<xml_diff>
--- a/templates/proposal-template.docx
+++ b/templates/proposal-template.docx
@@ -597,8 +597,8 @@
       <w:tblGrid>
         <w:gridCol w:w="915"/>
         <w:gridCol w:w="1800"/>
-        <w:gridCol w:w="4771"/>
-        <w:gridCol w:w="1585"/>
+        <w:gridCol w:w="4772"/>
+        <w:gridCol w:w="1584"/>
       </w:tblGrid>
       <w:tr>
         <w:trPr>
@@ -670,7 +670,7 @@
         </w:tc>
         <w:tc>
           <w:tcPr>
-            <w:tcW w:w="4771" w:type="dxa"/>
+            <w:tcW w:w="4772" w:type="dxa"/>
             <w:tcBorders>
               <w:top w:val="single" w:sz="4" w:space="0" w:color="000000"/>
               <w:left w:val="single" w:sz="4" w:space="0" w:color="000000"/>
@@ -702,7 +702,7 @@
         </w:tc>
         <w:tc>
           <w:tcPr>
-            <w:tcW w:w="1585" w:type="dxa"/>
+            <w:tcW w:w="1584" w:type="dxa"/>
             <w:tcBorders>
               <w:top w:val="single" w:sz="4" w:space="0" w:color="000000"/>
               <w:left w:val="single" w:sz="4" w:space="0" w:color="000000"/>
@@ -877,7 +877,7 @@
         </w:tc>
         <w:tc>
           <w:tcPr>
-            <w:tcW w:w="4771" w:type="dxa"/>
+            <w:tcW w:w="4772" w:type="dxa"/>
             <w:tcBorders>
               <w:top w:val="single" w:sz="4" w:space="0" w:color="000000"/>
               <w:left w:val="single" w:sz="4" w:space="0" w:color="000000"/>
@@ -931,7 +931,7 @@
         </w:tc>
         <w:tc>
           <w:tcPr>
-            <w:tcW w:w="1585" w:type="dxa"/>
+            <w:tcW w:w="1584" w:type="dxa"/>
             <w:tcBorders>
               <w:top w:val="single" w:sz="4" w:space="0" w:color="000000"/>
               <w:left w:val="single" w:sz="4" w:space="0" w:color="000000"/>
@@ -1034,7 +1034,7 @@
         </w:tc>
         <w:tc>
           <w:tcPr>
-            <w:tcW w:w="4771" w:type="dxa"/>
+            <w:tcW w:w="4772" w:type="dxa"/>
             <w:tcBorders>
               <w:top w:val="single" w:sz="4" w:space="0" w:color="000000"/>
               <w:left w:val="single" w:sz="4" w:space="0" w:color="000000"/>
@@ -1065,7 +1065,7 @@
         </w:tc>
         <w:tc>
           <w:tcPr>
-            <w:tcW w:w="1585" w:type="dxa"/>
+            <w:tcW w:w="1584" w:type="dxa"/>
             <w:tcBorders>
               <w:top w:val="single" w:sz="4" w:space="0" w:color="000000"/>
               <w:left w:val="single" w:sz="4" w:space="0" w:color="000000"/>
@@ -1174,7 +1174,7 @@
         </w:tc>
         <w:tc>
           <w:tcPr>
-            <w:tcW w:w="4771" w:type="dxa"/>
+            <w:tcW w:w="4772" w:type="dxa"/>
             <w:tcBorders>
               <w:left w:val="single" w:sz="4" w:space="0" w:color="000000"/>
               <w:bottom w:val="single" w:sz="4" w:space="0" w:color="000000"/>
@@ -1203,7 +1203,7 @@
         </w:tc>
         <w:tc>
           <w:tcPr>
-            <w:tcW w:w="1585" w:type="dxa"/>
+            <w:tcW w:w="1584" w:type="dxa"/>
             <w:tcBorders>
               <w:left w:val="single" w:sz="4" w:space="0" w:color="000000"/>
               <w:bottom w:val="single" w:sz="4" w:space="0" w:color="000000"/>
@@ -1302,7 +1302,7 @@
         </w:tc>
         <w:tc>
           <w:tcPr>
-            <w:tcW w:w="4771" w:type="dxa"/>
+            <w:tcW w:w="4772" w:type="dxa"/>
             <w:tcBorders>
               <w:left w:val="single" w:sz="4" w:space="0" w:color="000000"/>
               <w:bottom w:val="single" w:sz="4" w:space="0" w:color="000000"/>
@@ -1314,17 +1314,23 @@
               <w:pStyle w:val="Normal"/>
               <w:spacing w:lineRule="auto" w:line="240" w:before="0" w:afterAutospacing="0" w:after="0"/>
               <w:jc w:val="both"/>
-              <w:rPr/>
-            </w:pPr>
-            <w:r>
-              <w:rPr/>
+              <w:rPr>
+                <w:sz w:val="24"/>
+                <w:szCs w:val="24"/>
+              </w:rPr>
+            </w:pPr>
+            <w:r>
+              <w:rPr>
+                <w:sz w:val="24"/>
+                <w:szCs w:val="24"/>
+              </w:rPr>
               <w:t>{#hasDiscount}Zwischensumme Netto</w:t>
             </w:r>
           </w:p>
         </w:tc>
         <w:tc>
           <w:tcPr>
-            <w:tcW w:w="1585" w:type="dxa"/>
+            <w:tcW w:w="1584" w:type="dxa"/>
             <w:tcBorders>
               <w:left w:val="single" w:sz="4" w:space="0" w:color="000000"/>
               <w:bottom w:val="single" w:sz="4" w:space="0" w:color="000000"/>
@@ -1420,7 +1426,7 @@
         </w:tc>
         <w:tc>
           <w:tcPr>
-            <w:tcW w:w="4771" w:type="dxa"/>
+            <w:tcW w:w="4772" w:type="dxa"/>
             <w:tcBorders>
               <w:left w:val="single" w:sz="4" w:space="0" w:color="000000"/>
               <w:bottom w:val="single" w:sz="4" w:space="0" w:color="000000"/>
@@ -1448,7 +1454,7 @@
         </w:tc>
         <w:tc>
           <w:tcPr>
-            <w:tcW w:w="1585" w:type="dxa"/>
+            <w:tcW w:w="1584" w:type="dxa"/>
             <w:tcBorders>
               <w:left w:val="single" w:sz="4" w:space="0" w:color="000000"/>
               <w:bottom w:val="single" w:sz="4" w:space="0" w:color="000000"/>
@@ -1541,7 +1547,7 @@
         </w:tc>
         <w:tc>
           <w:tcPr>
-            <w:tcW w:w="4771" w:type="dxa"/>
+            <w:tcW w:w="4772" w:type="dxa"/>
             <w:tcBorders>
               <w:left w:val="single" w:sz="4" w:space="0" w:color="000000"/>
               <w:bottom w:val="single" w:sz="4" w:space="0" w:color="000000"/>
@@ -1571,7 +1577,7 @@
         </w:tc>
         <w:tc>
           <w:tcPr>
-            <w:tcW w:w="1585" w:type="dxa"/>
+            <w:tcW w:w="1584" w:type="dxa"/>
             <w:tcBorders>
               <w:left w:val="single" w:sz="4" w:space="0" w:color="000000"/>
               <w:bottom w:val="single" w:sz="4" w:space="0" w:color="000000"/>
@@ -1673,7 +1679,7 @@
         </w:tc>
         <w:tc>
           <w:tcPr>
-            <w:tcW w:w="4771" w:type="dxa"/>
+            <w:tcW w:w="4772" w:type="dxa"/>
             <w:tcBorders>
               <w:left w:val="single" w:sz="4" w:space="0" w:color="000000"/>
               <w:bottom w:val="single" w:sz="4" w:space="0" w:color="000000"/>
@@ -1703,7 +1709,7 @@
         </w:tc>
         <w:tc>
           <w:tcPr>
-            <w:tcW w:w="1585" w:type="dxa"/>
+            <w:tcW w:w="1584" w:type="dxa"/>
             <w:tcBorders>
               <w:left w:val="single" w:sz="4" w:space="0" w:color="000000"/>
               <w:bottom w:val="single" w:sz="4" w:space="0" w:color="000000"/>
@@ -1791,7 +1797,7 @@
         </w:tc>
         <w:tc>
           <w:tcPr>
-            <w:tcW w:w="4771" w:type="dxa"/>
+            <w:tcW w:w="4772" w:type="dxa"/>
             <w:tcBorders>
               <w:left w:val="single" w:sz="4" w:space="0" w:color="000000"/>
               <w:bottom w:val="single" w:sz="4" w:space="0" w:color="000000"/>
@@ -1824,7 +1830,7 @@
         </w:tc>
         <w:tc>
           <w:tcPr>
-            <w:tcW w:w="1585" w:type="dxa"/>
+            <w:tcW w:w="1584" w:type="dxa"/>
             <w:tcBorders>
               <w:left w:val="single" w:sz="4" w:space="0" w:color="000000"/>
               <w:bottom w:val="single" w:sz="4" w:space="0" w:color="000000"/>
@@ -1919,7 +1925,7 @@
         </w:tc>
         <w:tc>
           <w:tcPr>
-            <w:tcW w:w="4771" w:type="dxa"/>
+            <w:tcW w:w="4772" w:type="dxa"/>
             <w:tcBorders>
               <w:top w:val="single" w:sz="4" w:space="0" w:color="000000"/>
               <w:left w:val="single" w:sz="4" w:space="0" w:color="000000"/>
@@ -1948,7 +1954,7 @@
         </w:tc>
         <w:tc>
           <w:tcPr>
-            <w:tcW w:w="1585" w:type="dxa"/>
+            <w:tcW w:w="1584" w:type="dxa"/>
             <w:tcBorders>
               <w:top w:val="single" w:sz="4" w:space="0" w:color="000000"/>
               <w:left w:val="single" w:sz="4" w:space="0" w:color="000000"/>
@@ -2039,7 +2045,7 @@
         </w:tc>
         <w:tc>
           <w:tcPr>
-            <w:tcW w:w="4771" w:type="dxa"/>
+            <w:tcW w:w="4772" w:type="dxa"/>
             <w:tcBorders>
               <w:top w:val="single" w:sz="4" w:space="0" w:color="000000"/>
               <w:left w:val="single" w:sz="4" w:space="0" w:color="000000"/>
@@ -2069,7 +2075,7 @@
         </w:tc>
         <w:tc>
           <w:tcPr>
-            <w:tcW w:w="1585" w:type="dxa"/>
+            <w:tcW w:w="1584" w:type="dxa"/>
             <w:tcBorders>
               <w:top w:val="single" w:sz="4" w:space="0" w:color="000000"/>
               <w:left w:val="single" w:sz="4" w:space="0" w:color="000000"/>
@@ -2169,7 +2175,7 @@
         </w:tc>
         <w:tc>
           <w:tcPr>
-            <w:tcW w:w="4771" w:type="dxa"/>
+            <w:tcW w:w="4772" w:type="dxa"/>
             <w:tcBorders>
               <w:top w:val="single" w:sz="4" w:space="0" w:color="000000"/>
               <w:left w:val="single" w:sz="4" w:space="0" w:color="000000"/>
@@ -2199,7 +2205,7 @@
         </w:tc>
         <w:tc>
           <w:tcPr>
-            <w:tcW w:w="1585" w:type="dxa"/>
+            <w:tcW w:w="1584" w:type="dxa"/>
             <w:tcBorders>
               <w:top w:val="single" w:sz="4" w:space="0" w:color="000000"/>
               <w:left w:val="single" w:sz="4" w:space="0" w:color="000000"/>
@@ -2291,7 +2297,7 @@
         </w:tc>
         <w:tc>
           <w:tcPr>
-            <w:tcW w:w="4771" w:type="dxa"/>
+            <w:tcW w:w="4772" w:type="dxa"/>
             <w:tcBorders>
               <w:top w:val="single" w:sz="4" w:space="0" w:color="000000"/>
               <w:left w:val="single" w:sz="4" w:space="0" w:color="000000"/>
@@ -2320,7 +2326,7 @@
         </w:tc>
         <w:tc>
           <w:tcPr>
-            <w:tcW w:w="1585" w:type="dxa"/>
+            <w:tcW w:w="1584" w:type="dxa"/>
             <w:tcBorders>
               <w:top w:val="single" w:sz="4" w:space="0" w:color="000000"/>
               <w:left w:val="single" w:sz="4" w:space="0" w:color="000000"/>

</xml_diff>